<commit_message>
Primer informe de actividades
</commit_message>
<xml_diff>
--- a/1023630560, SAMUEL LÓPEZ, IA.docx
+++ b/1023630560, SAMUEL LÓPEZ, IA.docx
@@ -1,6 +1,6 @@
 
 <file path=word/document.xml><?xml version="1.0" encoding="utf-8"?>
-<w:document xmlns:wpc="http://schemas.microsoft.com/office/word/2010/wordprocessingCanvas" xmlns:cx="http://schemas.microsoft.com/office/drawing/2014/chartex" xmlns:cx1="http://schemas.microsoft.com/office/drawing/2015/9/8/chartex" xmlns:cx2="http://schemas.microsoft.com/office/drawing/2015/10/21/chartex" xmlns:cx3="http://schemas.microsoft.com/office/drawing/2016/5/9/chartex" xmlns:cx4="http://schemas.microsoft.com/office/drawing/2016/5/10/chartex" xmlns:cx5="http://schemas.microsoft.com/office/drawing/2016/5/11/chartex" xmlns:cx6="http://schemas.microsoft.com/office/drawing/2016/5/12/chartex" xmlns:cx7="http://schemas.microsoft.com/office/drawing/2016/5/13/chartex" xmlns:cx8="http://schemas.microsoft.com/office/drawing/2016/5/14/chartex" xmlns:mc="http://schemas.openxmlformats.org/markup-compatibility/2006" xmlns:aink="http://schemas.microsoft.com/office/drawing/2016/ink" xmlns:am3d="http://schemas.microsoft.com/office/drawing/2017/model3d" xmlns:o="urn:schemas-microsoft-com:office:office" xmlns:oel="http://schemas.microsoft.com/office/2019/extlst" xmlns:r="http://schemas.openxmlformats.org/officeDocument/2006/relationships" xmlns:m="http://schemas.openxmlformats.org/officeDocument/2006/math" xmlns:v="urn:schemas-microsoft-com:vml" xmlns:wp14="http://schemas.microsoft.com/office/word/2010/wordprocessingDrawing" xmlns:wp="http://schemas.openxmlformats.org/drawingml/2006/wordprocessingDrawing" xmlns:w10="urn:schemas-microsoft-com:office:word" xmlns:w="http://schemas.openxmlformats.org/wordprocessingml/2006/main" xmlns:w14="http://schemas.microsoft.com/office/word/2010/wordml" xmlns:w15="http://schemas.microsoft.com/office/word/2012/wordml" xmlns:w16cex="http://schemas.microsoft.com/office/word/2018/wordml/cex" xmlns:w16cid="http://schemas.microsoft.com/office/word/2016/wordml/cid" xmlns:w16="http://schemas.microsoft.com/office/word/2018/wordml" xmlns:w16du="http://schemas.microsoft.com/office/word/2023/wordml/word16du" xmlns:w16sdtdh="http://schemas.microsoft.com/office/word/2020/wordml/sdtdatahash" xmlns:w16se="http://schemas.microsoft.com/office/word/2015/wordml/symex" xmlns:wpg="http://schemas.microsoft.com/office/word/2010/wordprocessingGroup" xmlns:wpi="http://schemas.microsoft.com/office/word/2010/wordprocessingInk" xmlns:wne="http://schemas.microsoft.com/office/word/2006/wordml" xmlns:wps="http://schemas.microsoft.com/office/word/2010/wordprocessingShape" mc:Ignorable="w14 w15 w16se w16cid w16 w16cex w16sdtdh w16du wp14">
+<w:document xmlns:wpc="http://schemas.microsoft.com/office/word/2010/wordprocessingCanvas" xmlns:cx="http://schemas.microsoft.com/office/drawing/2014/chartex" xmlns:cx1="http://schemas.microsoft.com/office/drawing/2015/9/8/chartex" xmlns:cx2="http://schemas.microsoft.com/office/drawing/2015/10/21/chartex" xmlns:cx3="http://schemas.microsoft.com/office/drawing/2016/5/9/chartex" xmlns:cx4="http://schemas.microsoft.com/office/drawing/2016/5/10/chartex" xmlns:cx5="http://schemas.microsoft.com/office/drawing/2016/5/11/chartex" xmlns:cx6="http://schemas.microsoft.com/office/drawing/2016/5/12/chartex" xmlns:cx7="http://schemas.microsoft.com/office/drawing/2016/5/13/chartex" xmlns:cx8="http://schemas.microsoft.com/office/drawing/2016/5/14/chartex" xmlns:mc="http://schemas.openxmlformats.org/markup-compatibility/2006" xmlns:aink="http://schemas.microsoft.com/office/drawing/2016/ink" xmlns:am3d="http://schemas.microsoft.com/office/drawing/2017/model3d" xmlns:o="urn:schemas-microsoft-com:office:office" xmlns:oel="http://schemas.microsoft.com/office/2019/extlst" xmlns:r="http://schemas.openxmlformats.org/officeDocument/2006/relationships" xmlns:m="http://schemas.openxmlformats.org/officeDocument/2006/math" xmlns:v="urn:schemas-microsoft-com:vml" xmlns:wp14="http://schemas.microsoft.com/office/word/2010/wordprocessingDrawing" xmlns:wp="http://schemas.openxmlformats.org/drawingml/2006/wordprocessingDrawing" xmlns:w10="urn:schemas-microsoft-com:office:word" xmlns:w="http://schemas.openxmlformats.org/wordprocessingml/2006/main" xmlns:w14="http://schemas.microsoft.com/office/word/2010/wordml" xmlns:w15="http://schemas.microsoft.com/office/word/2012/wordml" xmlns:w16cex="http://schemas.microsoft.com/office/word/2018/wordml/cex" xmlns:w16cid="http://schemas.microsoft.com/office/word/2016/wordml/cid" xmlns:w16="http://schemas.microsoft.com/office/word/2018/wordml" xmlns:w16du="http://schemas.microsoft.com/office/word/2023/wordml/word16du" xmlns:w16sdtdh="http://schemas.microsoft.com/office/word/2020/wordml/sdtdatahash" xmlns:w16sdtfl="http://schemas.microsoft.com/office/word/2024/wordml/sdtformatlock" xmlns:w16se="http://schemas.microsoft.com/office/word/2015/wordml/symex" xmlns:wpg="http://schemas.microsoft.com/office/word/2010/wordprocessingGroup" xmlns:wpi="http://schemas.microsoft.com/office/word/2010/wordprocessingInk" xmlns:wne="http://schemas.microsoft.com/office/word/2006/wordml" xmlns:wps="http://schemas.microsoft.com/office/word/2010/wordprocessingShape" mc:Ignorable="w14 w15 w16se w16cid w16 w16cex w16sdtdh w16sdtfl w16du wp14">
   <w:body>
     <w:tbl>
       <w:tblPr>
@@ -1333,16 +1333,6 @@
           <w:rFonts w:asciiTheme="minorHAnsi" w:hAnsiTheme="minorHAnsi" w:cstheme="minorHAnsi"/>
           <w:sz w:val="20"/>
           <w:szCs w:val="20"/>
-        </w:rPr>
-      </w:pPr>
-    </w:p>
-    <w:p>
-      <w:pPr>
-        <w:spacing w:after="0"/>
-        <w:rPr>
-          <w:rFonts w:asciiTheme="minorHAnsi" w:hAnsiTheme="minorHAnsi" w:cstheme="minorHAnsi"/>
-          <w:sz w:val="20"/>
-          <w:szCs w:val="20"/>
           <w:u w:val="single"/>
         </w:rPr>
       </w:pPr>
@@ -1355,7 +1345,7 @@
           <w:u w:val="single"/>
         </w:rPr>
         <w:drawing>
-          <wp:inline distT="0" distB="0" distL="0" distR="0" wp14:anchorId="040F83AA" wp14:editId="39A06851">
+          <wp:inline distT="0" distB="0" distL="0" distR="0" wp14:anchorId="040F83AA" wp14:editId="1CDFA5B1">
             <wp:extent cx="1333500" cy="618259"/>
             <wp:effectExtent l="0" t="0" r="0" b="0"/>
             <wp:docPr id="1237766115" name="Imagen 1"/>
@@ -1472,6 +1462,56 @@
       <w:r>
         <w:rPr>
           <w:rFonts w:asciiTheme="minorHAnsi" w:hAnsiTheme="minorHAnsi" w:cstheme="minorHAnsi"/>
+          <w:noProof/>
+          <w:sz w:val="20"/>
+          <w:szCs w:val="20"/>
+          <w:u w:val="single"/>
+        </w:rPr>
+        <w:drawing>
+          <wp:inline distT="0" distB="0" distL="0" distR="0" wp14:anchorId="7F3E6900" wp14:editId="3AD1C782">
+            <wp:extent cx="1543879" cy="446622"/>
+            <wp:effectExtent l="0" t="0" r="5715" b="0"/>
+            <wp:docPr id="1839885271" name="Imagen 1"/>
+            <wp:cNvGraphicFramePr>
+              <a:graphicFrameLocks xmlns:a="http://schemas.openxmlformats.org/drawingml/2006/main" noChangeAspect="1"/>
+            </wp:cNvGraphicFramePr>
+            <a:graphic xmlns:a="http://schemas.openxmlformats.org/drawingml/2006/main">
+              <a:graphicData uri="http://schemas.openxmlformats.org/drawingml/2006/picture">
+                <pic:pic xmlns:pic="http://schemas.openxmlformats.org/drawingml/2006/picture">
+                  <pic:nvPicPr>
+                    <pic:cNvPr id="1839885271" name="Imagen 1839885271"/>
+                    <pic:cNvPicPr/>
+                  </pic:nvPicPr>
+                  <pic:blipFill>
+                    <a:blip r:embed="rId10">
+                      <a:extLst>
+                        <a:ext uri="{28A0092B-C50C-407E-A947-70E740481C1C}">
+                          <a14:useLocalDpi xmlns:a14="http://schemas.microsoft.com/office/drawing/2010/main" val="0"/>
+                        </a:ext>
+                      </a:extLst>
+                    </a:blip>
+                    <a:stretch>
+                      <a:fillRect/>
+                    </a:stretch>
+                  </pic:blipFill>
+                  <pic:spPr>
+                    <a:xfrm>
+                      <a:off x="0" y="0"/>
+                      <a:ext cx="1635069" cy="473002"/>
+                    </a:xfrm>
+                    <a:prstGeom prst="rect">
+                      <a:avLst/>
+                    </a:prstGeom>
+                  </pic:spPr>
+                </pic:pic>
+              </a:graphicData>
+            </a:graphic>
+          </wp:inline>
+        </w:drawing>
+      </w:r>
+      <w:r>
+        <w:rPr>
+          <w:rFonts w:asciiTheme="minorHAnsi" w:hAnsiTheme="minorHAnsi" w:cstheme="minorHAnsi"/>
           <w:sz w:val="20"/>
           <w:szCs w:val="20"/>
           <w:u w:val="single"/>
@@ -1639,7 +1679,7 @@
       </w:pPr>
     </w:p>
     <w:sectPr>
-      <w:headerReference w:type="default" r:id="rId10"/>
+      <w:headerReference w:type="default" r:id="rId11"/>
       <w:pgSz w:w="12240" w:h="15840"/>
       <w:pgMar w:top="1701" w:right="1134" w:bottom="1701" w:left="1134" w:header="709" w:footer="709" w:gutter="0"/>
       <w:cols w:space="708"/>
@@ -1650,7 +1690,7 @@
 </file>
 
 <file path=word/endnotes.xml><?xml version="1.0" encoding="utf-8"?>
-<w:endnotes xmlns:wpc="http://schemas.microsoft.com/office/word/2010/wordprocessingCanvas" xmlns:cx="http://schemas.microsoft.com/office/drawing/2014/chartex" xmlns:cx1="http://schemas.microsoft.com/office/drawing/2015/9/8/chartex" xmlns:cx2="http://schemas.microsoft.com/office/drawing/2015/10/21/chartex" xmlns:cx3="http://schemas.microsoft.com/office/drawing/2016/5/9/chartex" xmlns:cx4="http://schemas.microsoft.com/office/drawing/2016/5/10/chartex" xmlns:cx5="http://schemas.microsoft.com/office/drawing/2016/5/11/chartex" xmlns:cx6="http://schemas.microsoft.com/office/drawing/2016/5/12/chartex" xmlns:cx7="http://schemas.microsoft.com/office/drawing/2016/5/13/chartex" xmlns:cx8="http://schemas.microsoft.com/office/drawing/2016/5/14/chartex" xmlns:mc="http://schemas.openxmlformats.org/markup-compatibility/2006" xmlns:aink="http://schemas.microsoft.com/office/drawing/2016/ink" xmlns:am3d="http://schemas.microsoft.com/office/drawing/2017/model3d" xmlns:o="urn:schemas-microsoft-com:office:office" xmlns:oel="http://schemas.microsoft.com/office/2019/extlst" xmlns:r="http://schemas.openxmlformats.org/officeDocument/2006/relationships" xmlns:m="http://schemas.openxmlformats.org/officeDocument/2006/math" xmlns:v="urn:schemas-microsoft-com:vml" xmlns:wp14="http://schemas.microsoft.com/office/word/2010/wordprocessingDrawing" xmlns:wp="http://schemas.openxmlformats.org/drawingml/2006/wordprocessingDrawing" xmlns:w10="urn:schemas-microsoft-com:office:word" xmlns:w="http://schemas.openxmlformats.org/wordprocessingml/2006/main" xmlns:w14="http://schemas.microsoft.com/office/word/2010/wordml" xmlns:w15="http://schemas.microsoft.com/office/word/2012/wordml" xmlns:w16cex="http://schemas.microsoft.com/office/word/2018/wordml/cex" xmlns:w16cid="http://schemas.microsoft.com/office/word/2016/wordml/cid" xmlns:w16="http://schemas.microsoft.com/office/word/2018/wordml" xmlns:w16du="http://schemas.microsoft.com/office/word/2023/wordml/word16du" xmlns:w16sdtdh="http://schemas.microsoft.com/office/word/2020/wordml/sdtdatahash" xmlns:w16se="http://schemas.microsoft.com/office/word/2015/wordml/symex" xmlns:wpg="http://schemas.microsoft.com/office/word/2010/wordprocessingGroup" xmlns:wpi="http://schemas.microsoft.com/office/word/2010/wordprocessingInk" xmlns:wne="http://schemas.microsoft.com/office/word/2006/wordml" xmlns:wps="http://schemas.microsoft.com/office/word/2010/wordprocessingShape" mc:Ignorable="w14 w15 w16se w16cid w16 w16cex w16sdtdh w16du wp14">
+<w:endnotes xmlns:wpc="http://schemas.microsoft.com/office/word/2010/wordprocessingCanvas" xmlns:cx="http://schemas.microsoft.com/office/drawing/2014/chartex" xmlns:cx1="http://schemas.microsoft.com/office/drawing/2015/9/8/chartex" xmlns:cx2="http://schemas.microsoft.com/office/drawing/2015/10/21/chartex" xmlns:cx3="http://schemas.microsoft.com/office/drawing/2016/5/9/chartex" xmlns:cx4="http://schemas.microsoft.com/office/drawing/2016/5/10/chartex" xmlns:cx5="http://schemas.microsoft.com/office/drawing/2016/5/11/chartex" xmlns:cx6="http://schemas.microsoft.com/office/drawing/2016/5/12/chartex" xmlns:cx7="http://schemas.microsoft.com/office/drawing/2016/5/13/chartex" xmlns:cx8="http://schemas.microsoft.com/office/drawing/2016/5/14/chartex" xmlns:mc="http://schemas.openxmlformats.org/markup-compatibility/2006" xmlns:aink="http://schemas.microsoft.com/office/drawing/2016/ink" xmlns:am3d="http://schemas.microsoft.com/office/drawing/2017/model3d" xmlns:o="urn:schemas-microsoft-com:office:office" xmlns:oel="http://schemas.microsoft.com/office/2019/extlst" xmlns:r="http://schemas.openxmlformats.org/officeDocument/2006/relationships" xmlns:m="http://schemas.openxmlformats.org/officeDocument/2006/math" xmlns:v="urn:schemas-microsoft-com:vml" xmlns:wp14="http://schemas.microsoft.com/office/word/2010/wordprocessingDrawing" xmlns:wp="http://schemas.openxmlformats.org/drawingml/2006/wordprocessingDrawing" xmlns:w10="urn:schemas-microsoft-com:office:word" xmlns:w="http://schemas.openxmlformats.org/wordprocessingml/2006/main" xmlns:w14="http://schemas.microsoft.com/office/word/2010/wordml" xmlns:w15="http://schemas.microsoft.com/office/word/2012/wordml" xmlns:w16cex="http://schemas.microsoft.com/office/word/2018/wordml/cex" xmlns:w16cid="http://schemas.microsoft.com/office/word/2016/wordml/cid" xmlns:w16="http://schemas.microsoft.com/office/word/2018/wordml" xmlns:w16du="http://schemas.microsoft.com/office/word/2023/wordml/word16du" xmlns:w16sdtdh="http://schemas.microsoft.com/office/word/2020/wordml/sdtdatahash" xmlns:w16sdtfl="http://schemas.microsoft.com/office/word/2024/wordml/sdtformatlock" xmlns:w16se="http://schemas.microsoft.com/office/word/2015/wordml/symex" xmlns:wpg="http://schemas.microsoft.com/office/word/2010/wordprocessingGroup" xmlns:wpi="http://schemas.microsoft.com/office/word/2010/wordprocessingInk" xmlns:wne="http://schemas.microsoft.com/office/word/2006/wordml" xmlns:wps="http://schemas.microsoft.com/office/word/2010/wordprocessingShape" mc:Ignorable="w14 w15 w16se w16cid w16 w16cex w16sdtdh w16sdtfl w16du wp14">
   <w:endnote w:type="separator" w:id="-1">
     <w:p>
       <w:pPr>
@@ -1675,7 +1715,7 @@
 </file>
 
 <file path=word/footnotes.xml><?xml version="1.0" encoding="utf-8"?>
-<w:footnotes xmlns:wpc="http://schemas.microsoft.com/office/word/2010/wordprocessingCanvas" xmlns:cx="http://schemas.microsoft.com/office/drawing/2014/chartex" xmlns:cx1="http://schemas.microsoft.com/office/drawing/2015/9/8/chartex" xmlns:cx2="http://schemas.microsoft.com/office/drawing/2015/10/21/chartex" xmlns:cx3="http://schemas.microsoft.com/office/drawing/2016/5/9/chartex" xmlns:cx4="http://schemas.microsoft.com/office/drawing/2016/5/10/chartex" xmlns:cx5="http://schemas.microsoft.com/office/drawing/2016/5/11/chartex" xmlns:cx6="http://schemas.microsoft.com/office/drawing/2016/5/12/chartex" xmlns:cx7="http://schemas.microsoft.com/office/drawing/2016/5/13/chartex" xmlns:cx8="http://schemas.microsoft.com/office/drawing/2016/5/14/chartex" xmlns:mc="http://schemas.openxmlformats.org/markup-compatibility/2006" xmlns:aink="http://schemas.microsoft.com/office/drawing/2016/ink" xmlns:am3d="http://schemas.microsoft.com/office/drawing/2017/model3d" xmlns:o="urn:schemas-microsoft-com:office:office" xmlns:oel="http://schemas.microsoft.com/office/2019/extlst" xmlns:r="http://schemas.openxmlformats.org/officeDocument/2006/relationships" xmlns:m="http://schemas.openxmlformats.org/officeDocument/2006/math" xmlns:v="urn:schemas-microsoft-com:vml" xmlns:wp14="http://schemas.microsoft.com/office/word/2010/wordprocessingDrawing" xmlns:wp="http://schemas.openxmlformats.org/drawingml/2006/wordprocessingDrawing" xmlns:w10="urn:schemas-microsoft-com:office:word" xmlns:w="http://schemas.openxmlformats.org/wordprocessingml/2006/main" xmlns:w14="http://schemas.microsoft.com/office/word/2010/wordml" xmlns:w15="http://schemas.microsoft.com/office/word/2012/wordml" xmlns:w16cex="http://schemas.microsoft.com/office/word/2018/wordml/cex" xmlns:w16cid="http://schemas.microsoft.com/office/word/2016/wordml/cid" xmlns:w16="http://schemas.microsoft.com/office/word/2018/wordml" xmlns:w16du="http://schemas.microsoft.com/office/word/2023/wordml/word16du" xmlns:w16sdtdh="http://schemas.microsoft.com/office/word/2020/wordml/sdtdatahash" xmlns:w16se="http://schemas.microsoft.com/office/word/2015/wordml/symex" xmlns:wpg="http://schemas.microsoft.com/office/word/2010/wordprocessingGroup" xmlns:wpi="http://schemas.microsoft.com/office/word/2010/wordprocessingInk" xmlns:wne="http://schemas.microsoft.com/office/word/2006/wordml" xmlns:wps="http://schemas.microsoft.com/office/word/2010/wordprocessingShape" mc:Ignorable="w14 w15 w16se w16cid w16 w16cex w16sdtdh w16du wp14">
+<w:footnotes xmlns:wpc="http://schemas.microsoft.com/office/word/2010/wordprocessingCanvas" xmlns:cx="http://schemas.microsoft.com/office/drawing/2014/chartex" xmlns:cx1="http://schemas.microsoft.com/office/drawing/2015/9/8/chartex" xmlns:cx2="http://schemas.microsoft.com/office/drawing/2015/10/21/chartex" xmlns:cx3="http://schemas.microsoft.com/office/drawing/2016/5/9/chartex" xmlns:cx4="http://schemas.microsoft.com/office/drawing/2016/5/10/chartex" xmlns:cx5="http://schemas.microsoft.com/office/drawing/2016/5/11/chartex" xmlns:cx6="http://schemas.microsoft.com/office/drawing/2016/5/12/chartex" xmlns:cx7="http://schemas.microsoft.com/office/drawing/2016/5/13/chartex" xmlns:cx8="http://schemas.microsoft.com/office/drawing/2016/5/14/chartex" xmlns:mc="http://schemas.openxmlformats.org/markup-compatibility/2006" xmlns:aink="http://schemas.microsoft.com/office/drawing/2016/ink" xmlns:am3d="http://schemas.microsoft.com/office/drawing/2017/model3d" xmlns:o="urn:schemas-microsoft-com:office:office" xmlns:oel="http://schemas.microsoft.com/office/2019/extlst" xmlns:r="http://schemas.openxmlformats.org/officeDocument/2006/relationships" xmlns:m="http://schemas.openxmlformats.org/officeDocument/2006/math" xmlns:v="urn:schemas-microsoft-com:vml" xmlns:wp14="http://schemas.microsoft.com/office/word/2010/wordprocessingDrawing" xmlns:wp="http://schemas.openxmlformats.org/drawingml/2006/wordprocessingDrawing" xmlns:w10="urn:schemas-microsoft-com:office:word" xmlns:w="http://schemas.openxmlformats.org/wordprocessingml/2006/main" xmlns:w14="http://schemas.microsoft.com/office/word/2010/wordml" xmlns:w15="http://schemas.microsoft.com/office/word/2012/wordml" xmlns:w16cex="http://schemas.microsoft.com/office/word/2018/wordml/cex" xmlns:w16cid="http://schemas.microsoft.com/office/word/2016/wordml/cid" xmlns:w16="http://schemas.microsoft.com/office/word/2018/wordml" xmlns:w16du="http://schemas.microsoft.com/office/word/2023/wordml/word16du" xmlns:w16sdtdh="http://schemas.microsoft.com/office/word/2020/wordml/sdtdatahash" xmlns:w16sdtfl="http://schemas.microsoft.com/office/word/2024/wordml/sdtformatlock" xmlns:w16se="http://schemas.microsoft.com/office/word/2015/wordml/symex" xmlns:wpg="http://schemas.microsoft.com/office/word/2010/wordprocessingGroup" xmlns:wpi="http://schemas.microsoft.com/office/word/2010/wordprocessingInk" xmlns:wne="http://schemas.microsoft.com/office/word/2006/wordml" xmlns:wps="http://schemas.microsoft.com/office/word/2010/wordprocessingShape" mc:Ignorable="w14 w15 w16se w16cid w16 w16cex w16sdtdh w16sdtfl w16du wp14">
   <w:footnote w:type="separator" w:id="-1">
     <w:p>
       <w:pPr>
@@ -1700,7 +1740,7 @@
 </file>
 
 <file path=word/header1.xml><?xml version="1.0" encoding="utf-8"?>
-<w:hdr xmlns:wpc="http://schemas.microsoft.com/office/word/2010/wordprocessingCanvas" xmlns:cx="http://schemas.microsoft.com/office/drawing/2014/chartex" xmlns:cx1="http://schemas.microsoft.com/office/drawing/2015/9/8/chartex" xmlns:cx2="http://schemas.microsoft.com/office/drawing/2015/10/21/chartex" xmlns:cx3="http://schemas.microsoft.com/office/drawing/2016/5/9/chartex" xmlns:cx4="http://schemas.microsoft.com/office/drawing/2016/5/10/chartex" xmlns:cx5="http://schemas.microsoft.com/office/drawing/2016/5/11/chartex" xmlns:cx6="http://schemas.microsoft.com/office/drawing/2016/5/12/chartex" xmlns:cx7="http://schemas.microsoft.com/office/drawing/2016/5/13/chartex" xmlns:cx8="http://schemas.microsoft.com/office/drawing/2016/5/14/chartex" xmlns:mc="http://schemas.openxmlformats.org/markup-compatibility/2006" xmlns:aink="http://schemas.microsoft.com/office/drawing/2016/ink" xmlns:am3d="http://schemas.microsoft.com/office/drawing/2017/model3d" xmlns:o="urn:schemas-microsoft-com:office:office" xmlns:oel="http://schemas.microsoft.com/office/2019/extlst" xmlns:r="http://schemas.openxmlformats.org/officeDocument/2006/relationships" xmlns:m="http://schemas.openxmlformats.org/officeDocument/2006/math" xmlns:v="urn:schemas-microsoft-com:vml" xmlns:wp14="http://schemas.microsoft.com/office/word/2010/wordprocessingDrawing" xmlns:wp="http://schemas.openxmlformats.org/drawingml/2006/wordprocessingDrawing" xmlns:w10="urn:schemas-microsoft-com:office:word" xmlns:w="http://schemas.openxmlformats.org/wordprocessingml/2006/main" xmlns:w14="http://schemas.microsoft.com/office/word/2010/wordml" xmlns:w15="http://schemas.microsoft.com/office/word/2012/wordml" xmlns:w16cex="http://schemas.microsoft.com/office/word/2018/wordml/cex" xmlns:w16cid="http://schemas.microsoft.com/office/word/2016/wordml/cid" xmlns:w16="http://schemas.microsoft.com/office/word/2018/wordml" xmlns:w16du="http://schemas.microsoft.com/office/word/2023/wordml/word16du" xmlns:w16sdtdh="http://schemas.microsoft.com/office/word/2020/wordml/sdtdatahash" xmlns:w16se="http://schemas.microsoft.com/office/word/2015/wordml/symex" xmlns:wpg="http://schemas.microsoft.com/office/word/2010/wordprocessingGroup" xmlns:wpi="http://schemas.microsoft.com/office/word/2010/wordprocessingInk" xmlns:wne="http://schemas.microsoft.com/office/word/2006/wordml" xmlns:wps="http://schemas.microsoft.com/office/word/2010/wordprocessingShape" mc:Ignorable="w14 w15 w16se w16cid w16 w16cex w16sdtdh w16du wp14">
+<w:hdr xmlns:wpc="http://schemas.microsoft.com/office/word/2010/wordprocessingCanvas" xmlns:cx="http://schemas.microsoft.com/office/drawing/2014/chartex" xmlns:cx1="http://schemas.microsoft.com/office/drawing/2015/9/8/chartex" xmlns:cx2="http://schemas.microsoft.com/office/drawing/2015/10/21/chartex" xmlns:cx3="http://schemas.microsoft.com/office/drawing/2016/5/9/chartex" xmlns:cx4="http://schemas.microsoft.com/office/drawing/2016/5/10/chartex" xmlns:cx5="http://schemas.microsoft.com/office/drawing/2016/5/11/chartex" xmlns:cx6="http://schemas.microsoft.com/office/drawing/2016/5/12/chartex" xmlns:cx7="http://schemas.microsoft.com/office/drawing/2016/5/13/chartex" xmlns:cx8="http://schemas.microsoft.com/office/drawing/2016/5/14/chartex" xmlns:mc="http://schemas.openxmlformats.org/markup-compatibility/2006" xmlns:aink="http://schemas.microsoft.com/office/drawing/2016/ink" xmlns:am3d="http://schemas.microsoft.com/office/drawing/2017/model3d" xmlns:o="urn:schemas-microsoft-com:office:office" xmlns:oel="http://schemas.microsoft.com/office/2019/extlst" xmlns:r="http://schemas.openxmlformats.org/officeDocument/2006/relationships" xmlns:m="http://schemas.openxmlformats.org/officeDocument/2006/math" xmlns:v="urn:schemas-microsoft-com:vml" xmlns:wp14="http://schemas.microsoft.com/office/word/2010/wordprocessingDrawing" xmlns:wp="http://schemas.openxmlformats.org/drawingml/2006/wordprocessingDrawing" xmlns:w10="urn:schemas-microsoft-com:office:word" xmlns:w="http://schemas.openxmlformats.org/wordprocessingml/2006/main" xmlns:w14="http://schemas.microsoft.com/office/word/2010/wordml" xmlns:w15="http://schemas.microsoft.com/office/word/2012/wordml" xmlns:w16cex="http://schemas.microsoft.com/office/word/2018/wordml/cex" xmlns:w16cid="http://schemas.microsoft.com/office/word/2016/wordml/cid" xmlns:w16="http://schemas.microsoft.com/office/word/2018/wordml" xmlns:w16du="http://schemas.microsoft.com/office/word/2023/wordml/word16du" xmlns:w16sdtdh="http://schemas.microsoft.com/office/word/2020/wordml/sdtdatahash" xmlns:w16sdtfl="http://schemas.microsoft.com/office/word/2024/wordml/sdtformatlock" xmlns:w16se="http://schemas.microsoft.com/office/word/2015/wordml/symex" xmlns:wpg="http://schemas.microsoft.com/office/word/2010/wordprocessingGroup" xmlns:wpi="http://schemas.microsoft.com/office/word/2010/wordprocessingInk" xmlns:wne="http://schemas.microsoft.com/office/word/2006/wordml" xmlns:wps="http://schemas.microsoft.com/office/word/2010/wordprocessingShape" mc:Ignorable="w14 w15 w16se w16cid w16 w16cex w16sdtdh w16sdtfl w16du wp14">
   <w:tbl>
     <w:tblPr>
       <w:tblW w:w="10508" w:type="dxa"/>
@@ -2108,7 +2148,7 @@
 </file>
 
 <file path=word/styles.xml><?xml version="1.0" encoding="utf-8"?>
-<w:styles xmlns:mc="http://schemas.openxmlformats.org/markup-compatibility/2006" xmlns:r="http://schemas.openxmlformats.org/officeDocument/2006/relationships" xmlns:w="http://schemas.openxmlformats.org/wordprocessingml/2006/main" xmlns:w14="http://schemas.microsoft.com/office/word/2010/wordml" xmlns:w15="http://schemas.microsoft.com/office/word/2012/wordml" xmlns:w16cex="http://schemas.microsoft.com/office/word/2018/wordml/cex" xmlns:w16cid="http://schemas.microsoft.com/office/word/2016/wordml/cid" xmlns:w16="http://schemas.microsoft.com/office/word/2018/wordml" xmlns:w16du="http://schemas.microsoft.com/office/word/2023/wordml/word16du" xmlns:w16sdtdh="http://schemas.microsoft.com/office/word/2020/wordml/sdtdatahash" xmlns:w16se="http://schemas.microsoft.com/office/word/2015/wordml/symex" mc:Ignorable="w14 w15 w16se w16cid w16 w16cex w16sdtdh w16du">
+<w:styles xmlns:mc="http://schemas.openxmlformats.org/markup-compatibility/2006" xmlns:r="http://schemas.openxmlformats.org/officeDocument/2006/relationships" xmlns:w="http://schemas.openxmlformats.org/wordprocessingml/2006/main" xmlns:w14="http://schemas.microsoft.com/office/word/2010/wordml" xmlns:w15="http://schemas.microsoft.com/office/word/2012/wordml" xmlns:w16cex="http://schemas.microsoft.com/office/word/2018/wordml/cex" xmlns:w16cid="http://schemas.microsoft.com/office/word/2016/wordml/cid" xmlns:w16="http://schemas.microsoft.com/office/word/2018/wordml" xmlns:w16du="http://schemas.microsoft.com/office/word/2023/wordml/word16du" xmlns:w16sdtdh="http://schemas.microsoft.com/office/word/2020/wordml/sdtdatahash" xmlns:w16sdtfl="http://schemas.microsoft.com/office/word/2024/wordml/sdtformatlock" xmlns:w16se="http://schemas.microsoft.com/office/word/2015/wordml/symex" mc:Ignorable="w14 w15 w16se w16cid w16 w16cex w16sdtdh w16sdtfl w16du">
   <w:docDefaults>
     <w:rPrDefault>
       <w:rPr>
@@ -2516,6 +2556,7 @@
   <w:style w:type="character" w:default="1" w:styleId="Fuentedeprrafopredeter">
     <w:name w:val="Default Paragraph Font"/>
     <w:uiPriority w:val="1"/>
+    <w:semiHidden/>
     <w:unhideWhenUsed/>
   </w:style>
   <w:style w:type="table" w:default="1" w:styleId="Tablanormal">
@@ -3022,26 +3063,6 @@
 </file>
 
 <file path=customXml/item1.xml><?xml version="1.0" encoding="utf-8"?>
-<p:properties xmlns:p="http://schemas.microsoft.com/office/2006/metadata/properties" xmlns:xsi="http://www.w3.org/2001/XMLSchema-instance" xmlns:pc="http://schemas.microsoft.com/office/infopath/2007/PartnerControls">
-  <documentManagement>
-    <lcf76f155ced4ddcb4097134ff3c332f xmlns="15c23b83-0a74-4dd8-96fd-c1cdb1965e64">
-      <Terms xmlns="http://schemas.microsoft.com/office/infopath/2007/PartnerControls"/>
-    </lcf76f155ced4ddcb4097134ff3c332f>
-    <TaxCatchAll xmlns="a9d0ce2f-9ce2-4b22-8e2a-723aa410c551" xsi:nil="true"/>
-  </documentManagement>
-</p:properties>
-</file>
-
-<file path=customXml/item2.xml><?xml version="1.0" encoding="utf-8"?>
-<?mso-contentType ?>
-<FormTemplates xmlns="http://schemas.microsoft.com/sharepoint/v3/contenttype/forms">
-  <Display>DocumentLibraryForm</Display>
-  <Edit>DocumentLibraryForm</Edit>
-  <New>DocumentLibraryForm</New>
-</FormTemplates>
-</file>
-
-<file path=customXml/item3.xml><?xml version="1.0" encoding="utf-8"?>
 <ct:contentTypeSchema xmlns:ct="http://schemas.microsoft.com/office/2006/metadata/contentType" xmlns:ma="http://schemas.microsoft.com/office/2006/metadata/properties/metaAttributes" ct:_="" ma:_="" ma:contentTypeName="Documento" ma:contentTypeID="0x010100108846D5F9C3AE4C85EBCC6E9567D38C" ma:contentTypeVersion="13" ma:contentTypeDescription="Crear nuevo documento." ma:contentTypeScope="" ma:versionID="234bf719b0d5b04b273866643ddfa94d">
   <xsd:schema xmlns:xsd="http://www.w3.org/2001/XMLSchema" xmlns:xs="http://www.w3.org/2001/XMLSchema" xmlns:p="http://schemas.microsoft.com/office/2006/metadata/properties" xmlns:ns2="15c23b83-0a74-4dd8-96fd-c1cdb1965e64" xmlns:ns3="a9d0ce2f-9ce2-4b22-8e2a-723aa410c551" targetNamespace="http://schemas.microsoft.com/office/2006/metadata/properties" ma:root="true" ma:fieldsID="4d848263e9339a884436c6a48d27beb6" ns2:_="" ns3:_="">
     <xsd:import namespace="15c23b83-0a74-4dd8-96fd-c1cdb1965e64"/>
@@ -3248,26 +3269,27 @@
 </ct:contentTypeSchema>
 </file>
 
-<file path=customXml/itemProps1.xml><?xml version="1.0" encoding="utf-8"?>
-<ds:datastoreItem xmlns:ds="http://schemas.openxmlformats.org/officeDocument/2006/customXml" ds:itemID="{FAEC7C88-3BC7-46FB-A03C-FBCCEAD2F93D}">
-  <ds:schemaRefs>
-    <ds:schemaRef ds:uri="http://schemas.microsoft.com/office/2006/metadata/properties"/>
-    <ds:schemaRef ds:uri="http://schemas.microsoft.com/office/infopath/2007/PartnerControls"/>
-    <ds:schemaRef ds:uri="15c23b83-0a74-4dd8-96fd-c1cdb1965e64"/>
-    <ds:schemaRef ds:uri="a9d0ce2f-9ce2-4b22-8e2a-723aa410c551"/>
-  </ds:schemaRefs>
-</ds:datastoreItem>
+<file path=customXml/item2.xml><?xml version="1.0" encoding="utf-8"?>
+<?mso-contentType ?>
+<FormTemplates xmlns="http://schemas.microsoft.com/sharepoint/v3/contenttype/forms">
+  <Display>DocumentLibraryForm</Display>
+  <Edit>DocumentLibraryForm</Edit>
+  <New>DocumentLibraryForm</New>
+</FormTemplates>
 </file>
 
-<file path=customXml/itemProps2.xml><?xml version="1.0" encoding="utf-8"?>
-<ds:datastoreItem xmlns:ds="http://schemas.openxmlformats.org/officeDocument/2006/customXml" ds:itemID="{6E42620F-EA52-46A3-AF92-9188E2FB2822}">
-  <ds:schemaRefs>
-    <ds:schemaRef ds:uri="http://schemas.microsoft.com/sharepoint/v3/contenttype/forms"/>
-  </ds:schemaRefs>
-</ds:datastoreItem>
+<file path=customXml/item3.xml><?xml version="1.0" encoding="utf-8"?>
+<p:properties xmlns:p="http://schemas.microsoft.com/office/2006/metadata/properties" xmlns:xsi="http://www.w3.org/2001/XMLSchema-instance" xmlns:pc="http://schemas.microsoft.com/office/infopath/2007/PartnerControls">
+  <documentManagement>
+    <lcf76f155ced4ddcb4097134ff3c332f xmlns="15c23b83-0a74-4dd8-96fd-c1cdb1965e64">
+      <Terms xmlns="http://schemas.microsoft.com/office/infopath/2007/PartnerControls"/>
+    </lcf76f155ced4ddcb4097134ff3c332f>
+    <TaxCatchAll xmlns="a9d0ce2f-9ce2-4b22-8e2a-723aa410c551" xsi:nil="true"/>
+  </documentManagement>
+</p:properties>
 </file>
 
-<file path=customXml/itemProps3.xml><?xml version="1.0" encoding="utf-8"?>
+<file path=customXml/itemProps1.xml><?xml version="1.0" encoding="utf-8"?>
 <ds:datastoreItem xmlns:ds="http://schemas.openxmlformats.org/officeDocument/2006/customXml" ds:itemID="{A0AC0BCA-7724-4C8A-92DC-0D15359ECDC3}">
   <ds:schemaRefs>
     <ds:schemaRef ds:uri="http://schemas.microsoft.com/office/2006/metadata/contentType"/>
@@ -3284,4 +3306,23 @@
     <ds:schemaRef ds:uri="http://schemas.microsoft.com/internal/obd"/>
   </ds:schemaRefs>
 </ds:datastoreItem>
+</file>
+
+<file path=customXml/itemProps2.xml><?xml version="1.0" encoding="utf-8"?>
+<ds:datastoreItem xmlns:ds="http://schemas.openxmlformats.org/officeDocument/2006/customXml" ds:itemID="{6E42620F-EA52-46A3-AF92-9188E2FB2822}">
+  <ds:schemaRefs>
+    <ds:schemaRef ds:uri="http://schemas.microsoft.com/sharepoint/v3/contenttype/forms"/>
+  </ds:schemaRefs>
+</ds:datastoreItem>
+</file>
+
+<file path=customXml/itemProps3.xml><?xml version="1.0" encoding="utf-8"?>
+<ds:datastoreItem xmlns:ds="http://schemas.openxmlformats.org/officeDocument/2006/customXml" ds:itemID="{FAEC7C88-3BC7-46FB-A03C-FBCCEAD2F93D}">
+  <ds:schemaRefs>
+    <ds:schemaRef ds:uri="http://schemas.microsoft.com/office/2006/metadata/properties"/>
+    <ds:schemaRef ds:uri="http://schemas.microsoft.com/office/infopath/2007/PartnerControls"/>
+    <ds:schemaRef ds:uri="15c23b83-0a74-4dd8-96fd-c1cdb1965e64"/>
+    <ds:schemaRef ds:uri="a9d0ce2f-9ce2-4b22-8e2a-723aa410c551"/>
+  </ds:schemaRefs>
+</ds:datastoreItem>
 </file>
</xml_diff>

<commit_message>
informe de actividad n.2
</commit_message>
<xml_diff>
--- a/1023630560, SAMUEL LÓPEZ, IA.docx
+++ b/1023630560, SAMUEL LÓPEZ, IA.docx
@@ -1,6 +1,6 @@
 
 <file path=word/document.xml><?xml version="1.0" encoding="utf-8"?>
-<w:document xmlns:wpc="http://schemas.microsoft.com/office/word/2010/wordprocessingCanvas" xmlns:cx="http://schemas.microsoft.com/office/drawing/2014/chartex" xmlns:cx1="http://schemas.microsoft.com/office/drawing/2015/9/8/chartex" xmlns:cx2="http://schemas.microsoft.com/office/drawing/2015/10/21/chartex" xmlns:cx3="http://schemas.microsoft.com/office/drawing/2016/5/9/chartex" xmlns:cx4="http://schemas.microsoft.com/office/drawing/2016/5/10/chartex" xmlns:cx5="http://schemas.microsoft.com/office/drawing/2016/5/11/chartex" xmlns:cx6="http://schemas.microsoft.com/office/drawing/2016/5/12/chartex" xmlns:cx7="http://schemas.microsoft.com/office/drawing/2016/5/13/chartex" xmlns:cx8="http://schemas.microsoft.com/office/drawing/2016/5/14/chartex" xmlns:mc="http://schemas.openxmlformats.org/markup-compatibility/2006" xmlns:aink="http://schemas.microsoft.com/office/drawing/2016/ink" xmlns:am3d="http://schemas.microsoft.com/office/drawing/2017/model3d" xmlns:o="urn:schemas-microsoft-com:office:office" xmlns:oel="http://schemas.microsoft.com/office/2019/extlst" xmlns:r="http://schemas.openxmlformats.org/officeDocument/2006/relationships" xmlns:m="http://schemas.openxmlformats.org/officeDocument/2006/math" xmlns:v="urn:schemas-microsoft-com:vml" xmlns:wp14="http://schemas.microsoft.com/office/word/2010/wordprocessingDrawing" xmlns:wp="http://schemas.openxmlformats.org/drawingml/2006/wordprocessingDrawing" xmlns:w10="urn:schemas-microsoft-com:office:word" xmlns:w="http://schemas.openxmlformats.org/wordprocessingml/2006/main" xmlns:w14="http://schemas.microsoft.com/office/word/2010/wordml" xmlns:w15="http://schemas.microsoft.com/office/word/2012/wordml" xmlns:w16cex="http://schemas.microsoft.com/office/word/2018/wordml/cex" xmlns:w16cid="http://schemas.microsoft.com/office/word/2016/wordml/cid" xmlns:w16="http://schemas.microsoft.com/office/word/2018/wordml" xmlns:w16du="http://schemas.microsoft.com/office/word/2023/wordml/word16du" xmlns:w16sdtdh="http://schemas.microsoft.com/office/word/2020/wordml/sdtdatahash" xmlns:w16sdtfl="http://schemas.microsoft.com/office/word/2024/wordml/sdtformatlock" xmlns:w16se="http://schemas.microsoft.com/office/word/2015/wordml/symex" xmlns:wpg="http://schemas.microsoft.com/office/word/2010/wordprocessingGroup" xmlns:wpi="http://schemas.microsoft.com/office/word/2010/wordprocessingInk" xmlns:wne="http://schemas.microsoft.com/office/word/2006/wordml" xmlns:wps="http://schemas.microsoft.com/office/word/2010/wordprocessingShape" mc:Ignorable="w14 w15 w16se w16cid w16 w16cex w16sdtdh w16sdtfl w16du wp14">
+<w:document xmlns:wpc="http://schemas.microsoft.com/office/word/2010/wordprocessingCanvas" xmlns:cx="http://schemas.microsoft.com/office/drawing/2014/chartex" xmlns:cx1="http://schemas.microsoft.com/office/drawing/2015/9/8/chartex" xmlns:cx2="http://schemas.microsoft.com/office/drawing/2015/10/21/chartex" xmlns:cx3="http://schemas.microsoft.com/office/drawing/2016/5/9/chartex" xmlns:cx4="http://schemas.microsoft.com/office/drawing/2016/5/10/chartex" xmlns:cx5="http://schemas.microsoft.com/office/drawing/2016/5/11/chartex" xmlns:cx6="http://schemas.microsoft.com/office/drawing/2016/5/12/chartex" xmlns:cx7="http://schemas.microsoft.com/office/drawing/2016/5/13/chartex" xmlns:cx8="http://schemas.microsoft.com/office/drawing/2016/5/14/chartex" xmlns:mc="http://schemas.openxmlformats.org/markup-compatibility/2006" xmlns:aink="http://schemas.microsoft.com/office/drawing/2016/ink" xmlns:am3d="http://schemas.microsoft.com/office/drawing/2017/model3d" xmlns:o="urn:schemas-microsoft-com:office:office" xmlns:oel="http://schemas.microsoft.com/office/2019/extlst" xmlns:r="http://schemas.openxmlformats.org/officeDocument/2006/relationships" xmlns:m="http://schemas.openxmlformats.org/officeDocument/2006/math" xmlns:v="urn:schemas-microsoft-com:vml" xmlns:wp14="http://schemas.microsoft.com/office/word/2010/wordprocessingDrawing" xmlns:wp="http://schemas.openxmlformats.org/drawingml/2006/wordprocessingDrawing" xmlns:w10="urn:schemas-microsoft-com:office:word" xmlns:w="http://schemas.openxmlformats.org/wordprocessingml/2006/main" xmlns:w14="http://schemas.microsoft.com/office/word/2010/wordml" xmlns:w15="http://schemas.microsoft.com/office/word/2012/wordml" xmlns:w16cex="http://schemas.microsoft.com/office/word/2018/wordml/cex" xmlns:w16cid="http://schemas.microsoft.com/office/word/2016/wordml/cid" xmlns:w16="http://schemas.microsoft.com/office/word/2018/wordml" xmlns:w16du="http://schemas.microsoft.com/office/word/2023/wordml/word16du" xmlns:w16sdtdh="http://schemas.microsoft.com/office/word/2020/wordml/sdtdatahash" xmlns:w16se="http://schemas.microsoft.com/office/word/2015/wordml/symex" xmlns:wpg="http://schemas.microsoft.com/office/word/2010/wordprocessingGroup" xmlns:wpi="http://schemas.microsoft.com/office/word/2010/wordprocessingInk" xmlns:wne="http://schemas.microsoft.com/office/word/2006/wordml" xmlns:wps="http://schemas.microsoft.com/office/word/2010/wordprocessingShape" mc:Ignorable="w14 w15 w16se w16cid w16 w16cex w16sdtdh w16du wp14">
   <w:body>
     <w:tbl>
       <w:tblPr>
@@ -69,7 +69,7 @@
                 <w:szCs w:val="20"/>
                 <w:lang w:eastAsia="es-ES"/>
               </w:rPr>
-              <w:t>1</w:t>
+              <w:t>2</w:t>
             </w:r>
           </w:p>
         </w:tc>
@@ -214,7 +214,7 @@
                 <w:szCs w:val="20"/>
                 <w:lang w:eastAsia="es-ES"/>
               </w:rPr>
-              <w:t>9 de abril de 2026</w:t>
+              <w:t>10 de mayo de 2026</w:t>
             </w:r>
           </w:p>
         </w:tc>
@@ -591,7 +591,7 @@
                 <w:szCs w:val="20"/>
                 <w:lang w:eastAsia="es-ES"/>
               </w:rPr>
-              <w:t>Marzo-abril</w:t>
+              <w:t>Abril-Mayo</w:t>
             </w:r>
           </w:p>
         </w:tc>
@@ -758,25 +758,7 @@
                 <w:szCs w:val="20"/>
                 <w:lang w:eastAsia="es-CO"/>
               </w:rPr>
-              <w:t xml:space="preserve">Conversión </w:t>
-            </w:r>
-            <w:r>
-              <w:rPr>
-                <w:rFonts w:asciiTheme="minorHAnsi" w:hAnsiTheme="minorHAnsi" w:cstheme="minorHAnsi"/>
-                <w:sz w:val="20"/>
-                <w:szCs w:val="20"/>
-                <w:lang w:eastAsia="es-CO"/>
-              </w:rPr>
-              <w:t xml:space="preserve">de </w:t>
-            </w:r>
-            <w:r>
-              <w:rPr>
-                <w:rFonts w:asciiTheme="minorHAnsi" w:hAnsiTheme="minorHAnsi" w:cstheme="minorHAnsi"/>
-                <w:sz w:val="20"/>
-                <w:szCs w:val="20"/>
-                <w:lang w:eastAsia="es-CO"/>
-              </w:rPr>
-              <w:t>binario a decimal en VHDL con visualización en display multiplexado.</w:t>
+              <w:t>Implementación de representación en punto fijo en VHDL.</w:t>
             </w:r>
           </w:p>
         </w:tc>
@@ -802,25 +784,23 @@
                 <w:sz w:val="20"/>
                 <w:szCs w:val="20"/>
               </w:rPr>
-              <w:t xml:space="preserve">Se desarrolló un módulo en VHDL capaz de recibir un número en formato binario y convertirlo a su equivalente en sistema decimal. Para la visualización, se implementó un sistema de multiplexación de </w:t>
-            </w:r>
-            <w:proofErr w:type="spellStart"/>
+              <w:t xml:space="preserve">Se desarrolló una extensión del sistema </w:t>
+            </w:r>
             <w:r>
               <w:rPr>
                 <w:rFonts w:asciiTheme="minorHAnsi" w:hAnsiTheme="minorHAnsi" w:cstheme="minorHAnsi"/>
                 <w:sz w:val="20"/>
                 <w:szCs w:val="20"/>
               </w:rPr>
-              <w:t>displays</w:t>
-            </w:r>
-            <w:proofErr w:type="spellEnd"/>
+              <w:t>de display multiplexado</w:t>
+            </w:r>
             <w:r>
               <w:rPr>
                 <w:rFonts w:asciiTheme="minorHAnsi" w:hAnsiTheme="minorHAnsi" w:cstheme="minorHAnsi"/>
                 <w:sz w:val="20"/>
                 <w:szCs w:val="20"/>
               </w:rPr>
-              <w:t xml:space="preserve"> de 7 segmentos, permitiendo mostrar múltiples dígitos utilizando un número reducido de pines de salida.</w:t>
+              <w:t xml:space="preserve"> incorporando el manejo de números en formato de punto fijo, permitiendo representar valores con parte entera y fraccionaria</w:t>
             </w:r>
           </w:p>
         </w:tc>
@@ -882,7 +862,7 @@
                 <w:szCs w:val="20"/>
                 <w:lang w:eastAsia="es-CO"/>
               </w:rPr>
-              <w:t>Implementación de representación en punto fijo en VHDL.</w:t>
+              <w:t>Diseño e implementación de un convertidor Buck controlado en VHDL.</w:t>
             </w:r>
           </w:p>
         </w:tc>
@@ -908,15 +888,7 @@
                 <w:sz w:val="20"/>
                 <w:szCs w:val="20"/>
               </w:rPr>
-              <w:t>Se desarrolló una extensión del sistema anterior, incorporando el manejo de números en formato de punto fijo, permitiendo representar valores con parte entera y fraccionaria</w:t>
-            </w:r>
-            <w:r>
-              <w:rPr>
-                <w:rFonts w:asciiTheme="minorHAnsi" w:hAnsiTheme="minorHAnsi" w:cstheme="minorHAnsi"/>
-                <w:sz w:val="20"/>
-                <w:szCs w:val="20"/>
-              </w:rPr>
-              <w:t>.</w:t>
+              <w:t>Se desarrolló un sistema basado en VHDL para el control de un convertidor Buck, permitiendo reducir y regular el nivel de voltaje de salida mediante señales PWM generadas desde la FPGA. Se realizaron pruebas funcionales de conmutación y análisis del comportamiento del sistema ante diferentes ciclos de trabajo.</w:t>
             </w:r>
           </w:p>
         </w:tc>
@@ -943,7 +915,7 @@
                 <w:sz w:val="20"/>
                 <w:szCs w:val="20"/>
               </w:rPr>
-              <w:t>50%</w:t>
+              <w:t>100%</w:t>
             </w:r>
           </w:p>
         </w:tc>
@@ -971,6 +943,15 @@
                 <w:lang w:eastAsia="es-CO"/>
               </w:rPr>
             </w:pPr>
+            <w:r>
+              <w:rPr>
+                <w:rFonts w:asciiTheme="minorHAnsi" w:hAnsiTheme="minorHAnsi" w:cstheme="minorHAnsi"/>
+                <w:sz w:val="20"/>
+                <w:szCs w:val="20"/>
+                <w:lang w:eastAsia="es-CO"/>
+              </w:rPr>
+              <w:t>Implementación de salida analógica mediante PMOD DA3 y visualización en osciloscopio.</w:t>
+            </w:r>
           </w:p>
         </w:tc>
         <w:tc>
@@ -989,6 +970,14 @@
                 <w:szCs w:val="20"/>
               </w:rPr>
             </w:pPr>
+            <w:r>
+              <w:rPr>
+                <w:rFonts w:asciiTheme="minorHAnsi" w:hAnsiTheme="minorHAnsi" w:cstheme="minorHAnsi"/>
+                <w:sz w:val="20"/>
+                <w:szCs w:val="20"/>
+              </w:rPr>
+              <w:t>Se implementó la comunicación SPI entre la FPGA y el módulo DAC PMOD DA3 para convertir señales digitales a analógicas. Adicionalmente, se realizaron pruebas de visualización de las señales generadas utilizando un osciloscopio, verificando el correcto funcionamiento de la conversión digital–análoga.</w:t>
+            </w:r>
           </w:p>
         </w:tc>
         <w:tc>
@@ -1008,195 +997,14 @@
                 <w:szCs w:val="20"/>
               </w:rPr>
             </w:pPr>
-          </w:p>
-        </w:tc>
-      </w:tr>
-      <w:tr>
-        <w:trPr>
-          <w:trHeight w:val="340"/>
-          <w:jc w:val="center"/>
-        </w:trPr>
-        <w:tc>
-          <w:tcPr>
-            <w:tcW w:w="2547" w:type="dxa"/>
-            <w:vAlign w:val="center"/>
-          </w:tcPr>
-          <w:p>
-            <w:pPr>
-              <w:autoSpaceDE w:val="0"/>
-              <w:autoSpaceDN w:val="0"/>
-              <w:adjustRightInd w:val="0"/>
-              <w:spacing w:after="0"/>
+            <w:r>
               <w:rPr>
                 <w:rFonts w:asciiTheme="minorHAnsi" w:hAnsiTheme="minorHAnsi" w:cstheme="minorHAnsi"/>
                 <w:sz w:val="20"/>
                 <w:szCs w:val="20"/>
-                <w:lang w:eastAsia="es-CO"/>
-              </w:rPr>
-            </w:pPr>
-          </w:p>
-        </w:tc>
-        <w:tc>
-          <w:tcPr>
-            <w:tcW w:w="6638" w:type="dxa"/>
-            <w:vAlign w:val="center"/>
-          </w:tcPr>
-          <w:p>
-            <w:pPr>
-              <w:pStyle w:val="Prrafodelista"/>
-              <w:spacing w:line="276" w:lineRule="auto"/>
-              <w:ind w:left="0"/>
-              <w:rPr>
-                <w:rFonts w:asciiTheme="minorHAnsi" w:hAnsiTheme="minorHAnsi" w:cstheme="minorHAnsi"/>
-                <w:sz w:val="20"/>
-                <w:szCs w:val="20"/>
-              </w:rPr>
-            </w:pPr>
-          </w:p>
-        </w:tc>
-        <w:tc>
-          <w:tcPr>
-            <w:tcW w:w="1247" w:type="dxa"/>
-            <w:vAlign w:val="center"/>
-          </w:tcPr>
-          <w:p>
-            <w:pPr>
-              <w:pStyle w:val="Prrafodelista"/>
-              <w:spacing w:line="276" w:lineRule="auto"/>
-              <w:ind w:left="0"/>
-              <w:jc w:val="center"/>
-              <w:rPr>
-                <w:rFonts w:asciiTheme="minorHAnsi" w:hAnsiTheme="minorHAnsi" w:cstheme="minorHAnsi"/>
-                <w:sz w:val="20"/>
-                <w:szCs w:val="20"/>
-              </w:rPr>
-            </w:pPr>
-          </w:p>
-        </w:tc>
-      </w:tr>
-      <w:tr>
-        <w:trPr>
-          <w:trHeight w:val="340"/>
-          <w:jc w:val="center"/>
-        </w:trPr>
-        <w:tc>
-          <w:tcPr>
-            <w:tcW w:w="2547" w:type="dxa"/>
-            <w:vAlign w:val="center"/>
-          </w:tcPr>
-          <w:p>
-            <w:pPr>
-              <w:autoSpaceDE w:val="0"/>
-              <w:autoSpaceDN w:val="0"/>
-              <w:adjustRightInd w:val="0"/>
-              <w:spacing w:after="0"/>
-              <w:rPr>
-                <w:rFonts w:asciiTheme="minorHAnsi" w:hAnsiTheme="minorHAnsi" w:cstheme="minorHAnsi"/>
-                <w:sz w:val="20"/>
-                <w:szCs w:val="20"/>
-                <w:lang w:eastAsia="es-CO"/>
-              </w:rPr>
-            </w:pPr>
-          </w:p>
-        </w:tc>
-        <w:tc>
-          <w:tcPr>
-            <w:tcW w:w="6638" w:type="dxa"/>
-            <w:vAlign w:val="center"/>
-          </w:tcPr>
-          <w:p>
-            <w:pPr>
-              <w:pStyle w:val="Prrafodelista"/>
-              <w:spacing w:line="276" w:lineRule="auto"/>
-              <w:ind w:left="0"/>
-              <w:rPr>
-                <w:rFonts w:asciiTheme="minorHAnsi" w:hAnsiTheme="minorHAnsi" w:cstheme="minorHAnsi"/>
-                <w:sz w:val="20"/>
-                <w:szCs w:val="20"/>
-              </w:rPr>
-            </w:pPr>
-          </w:p>
-        </w:tc>
-        <w:tc>
-          <w:tcPr>
-            <w:tcW w:w="1247" w:type="dxa"/>
-            <w:vAlign w:val="center"/>
-          </w:tcPr>
-          <w:p>
-            <w:pPr>
-              <w:pStyle w:val="Prrafodelista"/>
-              <w:spacing w:line="276" w:lineRule="auto"/>
-              <w:ind w:left="0"/>
-              <w:jc w:val="center"/>
-              <w:rPr>
-                <w:rFonts w:asciiTheme="minorHAnsi" w:hAnsiTheme="minorHAnsi" w:cstheme="minorHAnsi"/>
-                <w:sz w:val="20"/>
-                <w:szCs w:val="20"/>
-              </w:rPr>
-            </w:pPr>
-          </w:p>
-        </w:tc>
-      </w:tr>
-      <w:tr>
-        <w:trPr>
-          <w:trHeight w:val="340"/>
-          <w:jc w:val="center"/>
-        </w:trPr>
-        <w:tc>
-          <w:tcPr>
-            <w:tcW w:w="2547" w:type="dxa"/>
-            <w:vAlign w:val="center"/>
-          </w:tcPr>
-          <w:p>
-            <w:pPr>
-              <w:autoSpaceDE w:val="0"/>
-              <w:autoSpaceDN w:val="0"/>
-              <w:adjustRightInd w:val="0"/>
-              <w:spacing w:after="0"/>
-              <w:rPr>
-                <w:rFonts w:asciiTheme="minorHAnsi" w:hAnsiTheme="minorHAnsi" w:cstheme="minorHAnsi"/>
-                <w:sz w:val="20"/>
-                <w:szCs w:val="20"/>
-                <w:lang w:eastAsia="es-CO"/>
-              </w:rPr>
-            </w:pPr>
-          </w:p>
-        </w:tc>
-        <w:tc>
-          <w:tcPr>
-            <w:tcW w:w="6638" w:type="dxa"/>
-            <w:vAlign w:val="center"/>
-          </w:tcPr>
-          <w:p>
-            <w:pPr>
-              <w:pStyle w:val="Prrafodelista"/>
-              <w:spacing w:line="276" w:lineRule="auto"/>
-              <w:ind w:left="0"/>
-              <w:rPr>
-                <w:rFonts w:asciiTheme="minorHAnsi" w:hAnsiTheme="minorHAnsi" w:cstheme="minorHAnsi"/>
-                <w:sz w:val="20"/>
-                <w:szCs w:val="20"/>
-              </w:rPr>
-            </w:pPr>
-          </w:p>
-        </w:tc>
-        <w:tc>
-          <w:tcPr>
-            <w:tcW w:w="1247" w:type="dxa"/>
-            <w:vAlign w:val="center"/>
-          </w:tcPr>
-          <w:p>
-            <w:pPr>
-              <w:pStyle w:val="Prrafodelista"/>
-              <w:spacing w:line="276" w:lineRule="auto"/>
-              <w:ind w:left="0"/>
-              <w:jc w:val="center"/>
-              <w:rPr>
-                <w:rFonts w:asciiTheme="minorHAnsi" w:hAnsiTheme="minorHAnsi" w:cstheme="minorHAnsi"/>
-                <w:sz w:val="20"/>
-                <w:szCs w:val="20"/>
-              </w:rPr>
-            </w:pPr>
+              </w:rPr>
+              <w:t>50%</w:t>
+            </w:r>
           </w:p>
         </w:tc>
       </w:tr>
@@ -1333,6 +1141,16 @@
           <w:rFonts w:asciiTheme="minorHAnsi" w:hAnsiTheme="minorHAnsi" w:cstheme="minorHAnsi"/>
           <w:sz w:val="20"/>
           <w:szCs w:val="20"/>
+        </w:rPr>
+      </w:pPr>
+    </w:p>
+    <w:p>
+      <w:pPr>
+        <w:spacing w:after="0"/>
+        <w:rPr>
+          <w:rFonts w:asciiTheme="minorHAnsi" w:hAnsiTheme="minorHAnsi" w:cstheme="minorHAnsi"/>
+          <w:sz w:val="20"/>
+          <w:szCs w:val="20"/>
           <w:u w:val="single"/>
         </w:rPr>
       </w:pPr>
@@ -1345,10 +1163,10 @@
           <w:u w:val="single"/>
         </w:rPr>
         <w:drawing>
-          <wp:inline distT="0" distB="0" distL="0" distR="0" wp14:anchorId="040F83AA" wp14:editId="1CDFA5B1">
-            <wp:extent cx="1333500" cy="618259"/>
+          <wp:inline distT="0" distB="0" distL="0" distR="0" wp14:anchorId="7EF4A5F4" wp14:editId="4F68B4FD">
+            <wp:extent cx="1409700" cy="679496"/>
             <wp:effectExtent l="0" t="0" r="0" b="0"/>
-            <wp:docPr id="1237766115" name="Imagen 1"/>
+            <wp:docPr id="1395513098" name="Imagen 1"/>
             <wp:cNvGraphicFramePr>
               <a:graphicFrameLocks xmlns:a="http://schemas.openxmlformats.org/drawingml/2006/main" noChangeAspect="1"/>
             </wp:cNvGraphicFramePr>
@@ -1356,7 +1174,7 @@
               <a:graphicData uri="http://schemas.openxmlformats.org/drawingml/2006/picture">
                 <pic:pic xmlns:pic="http://schemas.openxmlformats.org/drawingml/2006/picture">
                   <pic:nvPicPr>
-                    <pic:cNvPr id="1237766115" name="Imagen 1237766115"/>
+                    <pic:cNvPr id="1395513098" name="Imagen 1395513098"/>
                     <pic:cNvPicPr/>
                   </pic:nvPicPr>
                   <pic:blipFill rotWithShape="1">
@@ -1367,13 +1185,13 @@
                         </a:ext>
                       </a:extLst>
                     </a:blip>
-                    <a:srcRect l="-2500" t="12501" r="33750" b="45000"/>
+                    <a:srcRect l="7438" t="17080" r="35124" b="46006"/>
                     <a:stretch/>
                   </pic:blipFill>
                   <pic:spPr bwMode="auto">
                     <a:xfrm>
                       <a:off x="0" y="0"/>
-                      <a:ext cx="1369196" cy="634809"/>
+                      <a:ext cx="1424207" cy="686488"/>
                     </a:xfrm>
                     <a:prstGeom prst="rect">
                       <a:avLst/>
@@ -1407,7 +1225,6 @@
           <w:rFonts w:asciiTheme="minorHAnsi" w:hAnsiTheme="minorHAnsi" w:cstheme="minorHAnsi"/>
           <w:sz w:val="20"/>
           <w:szCs w:val="20"/>
-          <w:u w:val="single"/>
         </w:rPr>
         <w:tab/>
       </w:r>
@@ -1440,81 +1257,6 @@
           <w:rFonts w:asciiTheme="minorHAnsi" w:hAnsiTheme="minorHAnsi" w:cstheme="minorHAnsi"/>
           <w:sz w:val="20"/>
           <w:szCs w:val="20"/>
-        </w:rPr>
-        <w:tab/>
-      </w:r>
-      <w:r>
-        <w:rPr>
-          <w:rFonts w:asciiTheme="minorHAnsi" w:hAnsiTheme="minorHAnsi" w:cstheme="minorHAnsi"/>
-          <w:sz w:val="20"/>
-          <w:szCs w:val="20"/>
-        </w:rPr>
-        <w:tab/>
-      </w:r>
-      <w:r>
-        <w:rPr>
-          <w:rFonts w:asciiTheme="minorHAnsi" w:hAnsiTheme="minorHAnsi" w:cstheme="minorHAnsi"/>
-          <w:sz w:val="20"/>
-          <w:szCs w:val="20"/>
-        </w:rPr>
-        <w:t>_</w:t>
-      </w:r>
-      <w:r>
-        <w:rPr>
-          <w:rFonts w:asciiTheme="minorHAnsi" w:hAnsiTheme="minorHAnsi" w:cstheme="minorHAnsi"/>
-          <w:noProof/>
-          <w:sz w:val="20"/>
-          <w:szCs w:val="20"/>
-          <w:u w:val="single"/>
-        </w:rPr>
-        <w:drawing>
-          <wp:inline distT="0" distB="0" distL="0" distR="0" wp14:anchorId="7F3E6900" wp14:editId="3AD1C782">
-            <wp:extent cx="1543879" cy="446622"/>
-            <wp:effectExtent l="0" t="0" r="5715" b="0"/>
-            <wp:docPr id="1839885271" name="Imagen 1"/>
-            <wp:cNvGraphicFramePr>
-              <a:graphicFrameLocks xmlns:a="http://schemas.openxmlformats.org/drawingml/2006/main" noChangeAspect="1"/>
-            </wp:cNvGraphicFramePr>
-            <a:graphic xmlns:a="http://schemas.openxmlformats.org/drawingml/2006/main">
-              <a:graphicData uri="http://schemas.openxmlformats.org/drawingml/2006/picture">
-                <pic:pic xmlns:pic="http://schemas.openxmlformats.org/drawingml/2006/picture">
-                  <pic:nvPicPr>
-                    <pic:cNvPr id="1839885271" name="Imagen 1839885271"/>
-                    <pic:cNvPicPr/>
-                  </pic:nvPicPr>
-                  <pic:blipFill>
-                    <a:blip r:embed="rId10">
-                      <a:extLst>
-                        <a:ext uri="{28A0092B-C50C-407E-A947-70E740481C1C}">
-                          <a14:useLocalDpi xmlns:a14="http://schemas.microsoft.com/office/drawing/2010/main" val="0"/>
-                        </a:ext>
-                      </a:extLst>
-                    </a:blip>
-                    <a:stretch>
-                      <a:fillRect/>
-                    </a:stretch>
-                  </pic:blipFill>
-                  <pic:spPr>
-                    <a:xfrm>
-                      <a:off x="0" y="0"/>
-                      <a:ext cx="1635069" cy="473002"/>
-                    </a:xfrm>
-                    <a:prstGeom prst="rect">
-                      <a:avLst/>
-                    </a:prstGeom>
-                  </pic:spPr>
-                </pic:pic>
-              </a:graphicData>
-            </a:graphic>
-          </wp:inline>
-        </w:drawing>
-      </w:r>
-      <w:r>
-        <w:rPr>
-          <w:rFonts w:asciiTheme="minorHAnsi" w:hAnsiTheme="minorHAnsi" w:cstheme="minorHAnsi"/>
-          <w:sz w:val="20"/>
-          <w:szCs w:val="20"/>
-          <w:u w:val="single"/>
         </w:rPr>
         <w:tab/>
       </w:r>
@@ -1679,7 +1421,7 @@
       </w:pPr>
     </w:p>
     <w:sectPr>
-      <w:headerReference w:type="default" r:id="rId11"/>
+      <w:headerReference w:type="default" r:id="rId10"/>
       <w:pgSz w:w="12240" w:h="15840"/>
       <w:pgMar w:top="1701" w:right="1134" w:bottom="1701" w:left="1134" w:header="709" w:footer="709" w:gutter="0"/>
       <w:cols w:space="708"/>
@@ -1690,7 +1432,7 @@
 </file>
 
 <file path=word/endnotes.xml><?xml version="1.0" encoding="utf-8"?>
-<w:endnotes xmlns:wpc="http://schemas.microsoft.com/office/word/2010/wordprocessingCanvas" xmlns:cx="http://schemas.microsoft.com/office/drawing/2014/chartex" xmlns:cx1="http://schemas.microsoft.com/office/drawing/2015/9/8/chartex" xmlns:cx2="http://schemas.microsoft.com/office/drawing/2015/10/21/chartex" xmlns:cx3="http://schemas.microsoft.com/office/drawing/2016/5/9/chartex" xmlns:cx4="http://schemas.microsoft.com/office/drawing/2016/5/10/chartex" xmlns:cx5="http://schemas.microsoft.com/office/drawing/2016/5/11/chartex" xmlns:cx6="http://schemas.microsoft.com/office/drawing/2016/5/12/chartex" xmlns:cx7="http://schemas.microsoft.com/office/drawing/2016/5/13/chartex" xmlns:cx8="http://schemas.microsoft.com/office/drawing/2016/5/14/chartex" xmlns:mc="http://schemas.openxmlformats.org/markup-compatibility/2006" xmlns:aink="http://schemas.microsoft.com/office/drawing/2016/ink" xmlns:am3d="http://schemas.microsoft.com/office/drawing/2017/model3d" xmlns:o="urn:schemas-microsoft-com:office:office" xmlns:oel="http://schemas.microsoft.com/office/2019/extlst" xmlns:r="http://schemas.openxmlformats.org/officeDocument/2006/relationships" xmlns:m="http://schemas.openxmlformats.org/officeDocument/2006/math" xmlns:v="urn:schemas-microsoft-com:vml" xmlns:wp14="http://schemas.microsoft.com/office/word/2010/wordprocessingDrawing" xmlns:wp="http://schemas.openxmlformats.org/drawingml/2006/wordprocessingDrawing" xmlns:w10="urn:schemas-microsoft-com:office:word" xmlns:w="http://schemas.openxmlformats.org/wordprocessingml/2006/main" xmlns:w14="http://schemas.microsoft.com/office/word/2010/wordml" xmlns:w15="http://schemas.microsoft.com/office/word/2012/wordml" xmlns:w16cex="http://schemas.microsoft.com/office/word/2018/wordml/cex" xmlns:w16cid="http://schemas.microsoft.com/office/word/2016/wordml/cid" xmlns:w16="http://schemas.microsoft.com/office/word/2018/wordml" xmlns:w16du="http://schemas.microsoft.com/office/word/2023/wordml/word16du" xmlns:w16sdtdh="http://schemas.microsoft.com/office/word/2020/wordml/sdtdatahash" xmlns:w16sdtfl="http://schemas.microsoft.com/office/word/2024/wordml/sdtformatlock" xmlns:w16se="http://schemas.microsoft.com/office/word/2015/wordml/symex" xmlns:wpg="http://schemas.microsoft.com/office/word/2010/wordprocessingGroup" xmlns:wpi="http://schemas.microsoft.com/office/word/2010/wordprocessingInk" xmlns:wne="http://schemas.microsoft.com/office/word/2006/wordml" xmlns:wps="http://schemas.microsoft.com/office/word/2010/wordprocessingShape" mc:Ignorable="w14 w15 w16se w16cid w16 w16cex w16sdtdh w16sdtfl w16du wp14">
+<w:endnotes xmlns:wpc="http://schemas.microsoft.com/office/word/2010/wordprocessingCanvas" xmlns:cx="http://schemas.microsoft.com/office/drawing/2014/chartex" xmlns:cx1="http://schemas.microsoft.com/office/drawing/2015/9/8/chartex" xmlns:cx2="http://schemas.microsoft.com/office/drawing/2015/10/21/chartex" xmlns:cx3="http://schemas.microsoft.com/office/drawing/2016/5/9/chartex" xmlns:cx4="http://schemas.microsoft.com/office/drawing/2016/5/10/chartex" xmlns:cx5="http://schemas.microsoft.com/office/drawing/2016/5/11/chartex" xmlns:cx6="http://schemas.microsoft.com/office/drawing/2016/5/12/chartex" xmlns:cx7="http://schemas.microsoft.com/office/drawing/2016/5/13/chartex" xmlns:cx8="http://schemas.microsoft.com/office/drawing/2016/5/14/chartex" xmlns:mc="http://schemas.openxmlformats.org/markup-compatibility/2006" xmlns:aink="http://schemas.microsoft.com/office/drawing/2016/ink" xmlns:am3d="http://schemas.microsoft.com/office/drawing/2017/model3d" xmlns:o="urn:schemas-microsoft-com:office:office" xmlns:oel="http://schemas.microsoft.com/office/2019/extlst" xmlns:r="http://schemas.openxmlformats.org/officeDocument/2006/relationships" xmlns:m="http://schemas.openxmlformats.org/officeDocument/2006/math" xmlns:v="urn:schemas-microsoft-com:vml" xmlns:wp14="http://schemas.microsoft.com/office/word/2010/wordprocessingDrawing" xmlns:wp="http://schemas.openxmlformats.org/drawingml/2006/wordprocessingDrawing" xmlns:w10="urn:schemas-microsoft-com:office:word" xmlns:w="http://schemas.openxmlformats.org/wordprocessingml/2006/main" xmlns:w14="http://schemas.microsoft.com/office/word/2010/wordml" xmlns:w15="http://schemas.microsoft.com/office/word/2012/wordml" xmlns:w16cex="http://schemas.microsoft.com/office/word/2018/wordml/cex" xmlns:w16cid="http://schemas.microsoft.com/office/word/2016/wordml/cid" xmlns:w16="http://schemas.microsoft.com/office/word/2018/wordml" xmlns:w16du="http://schemas.microsoft.com/office/word/2023/wordml/word16du" xmlns:w16sdtdh="http://schemas.microsoft.com/office/word/2020/wordml/sdtdatahash" xmlns:w16se="http://schemas.microsoft.com/office/word/2015/wordml/symex" xmlns:wpg="http://schemas.microsoft.com/office/word/2010/wordprocessingGroup" xmlns:wpi="http://schemas.microsoft.com/office/word/2010/wordprocessingInk" xmlns:wne="http://schemas.microsoft.com/office/word/2006/wordml" xmlns:wps="http://schemas.microsoft.com/office/word/2010/wordprocessingShape" mc:Ignorable="w14 w15 w16se w16cid w16 w16cex w16sdtdh w16du wp14">
   <w:endnote w:type="separator" w:id="-1">
     <w:p>
       <w:pPr>
@@ -1715,7 +1457,7 @@
 </file>
 
 <file path=word/footnotes.xml><?xml version="1.0" encoding="utf-8"?>
-<w:footnotes xmlns:wpc="http://schemas.microsoft.com/office/word/2010/wordprocessingCanvas" xmlns:cx="http://schemas.microsoft.com/office/drawing/2014/chartex" xmlns:cx1="http://schemas.microsoft.com/office/drawing/2015/9/8/chartex" xmlns:cx2="http://schemas.microsoft.com/office/drawing/2015/10/21/chartex" xmlns:cx3="http://schemas.microsoft.com/office/drawing/2016/5/9/chartex" xmlns:cx4="http://schemas.microsoft.com/office/drawing/2016/5/10/chartex" xmlns:cx5="http://schemas.microsoft.com/office/drawing/2016/5/11/chartex" xmlns:cx6="http://schemas.microsoft.com/office/drawing/2016/5/12/chartex" xmlns:cx7="http://schemas.microsoft.com/office/drawing/2016/5/13/chartex" xmlns:cx8="http://schemas.microsoft.com/office/drawing/2016/5/14/chartex" xmlns:mc="http://schemas.openxmlformats.org/markup-compatibility/2006" xmlns:aink="http://schemas.microsoft.com/office/drawing/2016/ink" xmlns:am3d="http://schemas.microsoft.com/office/drawing/2017/model3d" xmlns:o="urn:schemas-microsoft-com:office:office" xmlns:oel="http://schemas.microsoft.com/office/2019/extlst" xmlns:r="http://schemas.openxmlformats.org/officeDocument/2006/relationships" xmlns:m="http://schemas.openxmlformats.org/officeDocument/2006/math" xmlns:v="urn:schemas-microsoft-com:vml" xmlns:wp14="http://schemas.microsoft.com/office/word/2010/wordprocessingDrawing" xmlns:wp="http://schemas.openxmlformats.org/drawingml/2006/wordprocessingDrawing" xmlns:w10="urn:schemas-microsoft-com:office:word" xmlns:w="http://schemas.openxmlformats.org/wordprocessingml/2006/main" xmlns:w14="http://schemas.microsoft.com/office/word/2010/wordml" xmlns:w15="http://schemas.microsoft.com/office/word/2012/wordml" xmlns:w16cex="http://schemas.microsoft.com/office/word/2018/wordml/cex" xmlns:w16cid="http://schemas.microsoft.com/office/word/2016/wordml/cid" xmlns:w16="http://schemas.microsoft.com/office/word/2018/wordml" xmlns:w16du="http://schemas.microsoft.com/office/word/2023/wordml/word16du" xmlns:w16sdtdh="http://schemas.microsoft.com/office/word/2020/wordml/sdtdatahash" xmlns:w16sdtfl="http://schemas.microsoft.com/office/word/2024/wordml/sdtformatlock" xmlns:w16se="http://schemas.microsoft.com/office/word/2015/wordml/symex" xmlns:wpg="http://schemas.microsoft.com/office/word/2010/wordprocessingGroup" xmlns:wpi="http://schemas.microsoft.com/office/word/2010/wordprocessingInk" xmlns:wne="http://schemas.microsoft.com/office/word/2006/wordml" xmlns:wps="http://schemas.microsoft.com/office/word/2010/wordprocessingShape" mc:Ignorable="w14 w15 w16se w16cid w16 w16cex w16sdtdh w16sdtfl w16du wp14">
+<w:footnotes xmlns:wpc="http://schemas.microsoft.com/office/word/2010/wordprocessingCanvas" xmlns:cx="http://schemas.microsoft.com/office/drawing/2014/chartex" xmlns:cx1="http://schemas.microsoft.com/office/drawing/2015/9/8/chartex" xmlns:cx2="http://schemas.microsoft.com/office/drawing/2015/10/21/chartex" xmlns:cx3="http://schemas.microsoft.com/office/drawing/2016/5/9/chartex" xmlns:cx4="http://schemas.microsoft.com/office/drawing/2016/5/10/chartex" xmlns:cx5="http://schemas.microsoft.com/office/drawing/2016/5/11/chartex" xmlns:cx6="http://schemas.microsoft.com/office/drawing/2016/5/12/chartex" xmlns:cx7="http://schemas.microsoft.com/office/drawing/2016/5/13/chartex" xmlns:cx8="http://schemas.microsoft.com/office/drawing/2016/5/14/chartex" xmlns:mc="http://schemas.openxmlformats.org/markup-compatibility/2006" xmlns:aink="http://schemas.microsoft.com/office/drawing/2016/ink" xmlns:am3d="http://schemas.microsoft.com/office/drawing/2017/model3d" xmlns:o="urn:schemas-microsoft-com:office:office" xmlns:oel="http://schemas.microsoft.com/office/2019/extlst" xmlns:r="http://schemas.openxmlformats.org/officeDocument/2006/relationships" xmlns:m="http://schemas.openxmlformats.org/officeDocument/2006/math" xmlns:v="urn:schemas-microsoft-com:vml" xmlns:wp14="http://schemas.microsoft.com/office/word/2010/wordprocessingDrawing" xmlns:wp="http://schemas.openxmlformats.org/drawingml/2006/wordprocessingDrawing" xmlns:w10="urn:schemas-microsoft-com:office:word" xmlns:w="http://schemas.openxmlformats.org/wordprocessingml/2006/main" xmlns:w14="http://schemas.microsoft.com/office/word/2010/wordml" xmlns:w15="http://schemas.microsoft.com/office/word/2012/wordml" xmlns:w16cex="http://schemas.microsoft.com/office/word/2018/wordml/cex" xmlns:w16cid="http://schemas.microsoft.com/office/word/2016/wordml/cid" xmlns:w16="http://schemas.microsoft.com/office/word/2018/wordml" xmlns:w16du="http://schemas.microsoft.com/office/word/2023/wordml/word16du" xmlns:w16sdtdh="http://schemas.microsoft.com/office/word/2020/wordml/sdtdatahash" xmlns:w16se="http://schemas.microsoft.com/office/word/2015/wordml/symex" xmlns:wpg="http://schemas.microsoft.com/office/word/2010/wordprocessingGroup" xmlns:wpi="http://schemas.microsoft.com/office/word/2010/wordprocessingInk" xmlns:wne="http://schemas.microsoft.com/office/word/2006/wordml" xmlns:wps="http://schemas.microsoft.com/office/word/2010/wordprocessingShape" mc:Ignorable="w14 w15 w16se w16cid w16 w16cex w16sdtdh w16du wp14">
   <w:footnote w:type="separator" w:id="-1">
     <w:p>
       <w:pPr>
@@ -1740,7 +1482,7 @@
 </file>
 
 <file path=word/header1.xml><?xml version="1.0" encoding="utf-8"?>
-<w:hdr xmlns:wpc="http://schemas.microsoft.com/office/word/2010/wordprocessingCanvas" xmlns:cx="http://schemas.microsoft.com/office/drawing/2014/chartex" xmlns:cx1="http://schemas.microsoft.com/office/drawing/2015/9/8/chartex" xmlns:cx2="http://schemas.microsoft.com/office/drawing/2015/10/21/chartex" xmlns:cx3="http://schemas.microsoft.com/office/drawing/2016/5/9/chartex" xmlns:cx4="http://schemas.microsoft.com/office/drawing/2016/5/10/chartex" xmlns:cx5="http://schemas.microsoft.com/office/drawing/2016/5/11/chartex" xmlns:cx6="http://schemas.microsoft.com/office/drawing/2016/5/12/chartex" xmlns:cx7="http://schemas.microsoft.com/office/drawing/2016/5/13/chartex" xmlns:cx8="http://schemas.microsoft.com/office/drawing/2016/5/14/chartex" xmlns:mc="http://schemas.openxmlformats.org/markup-compatibility/2006" xmlns:aink="http://schemas.microsoft.com/office/drawing/2016/ink" xmlns:am3d="http://schemas.microsoft.com/office/drawing/2017/model3d" xmlns:o="urn:schemas-microsoft-com:office:office" xmlns:oel="http://schemas.microsoft.com/office/2019/extlst" xmlns:r="http://schemas.openxmlformats.org/officeDocument/2006/relationships" xmlns:m="http://schemas.openxmlformats.org/officeDocument/2006/math" xmlns:v="urn:schemas-microsoft-com:vml" xmlns:wp14="http://schemas.microsoft.com/office/word/2010/wordprocessingDrawing" xmlns:wp="http://schemas.openxmlformats.org/drawingml/2006/wordprocessingDrawing" xmlns:w10="urn:schemas-microsoft-com:office:word" xmlns:w="http://schemas.openxmlformats.org/wordprocessingml/2006/main" xmlns:w14="http://schemas.microsoft.com/office/word/2010/wordml" xmlns:w15="http://schemas.microsoft.com/office/word/2012/wordml" xmlns:w16cex="http://schemas.microsoft.com/office/word/2018/wordml/cex" xmlns:w16cid="http://schemas.microsoft.com/office/word/2016/wordml/cid" xmlns:w16="http://schemas.microsoft.com/office/word/2018/wordml" xmlns:w16du="http://schemas.microsoft.com/office/word/2023/wordml/word16du" xmlns:w16sdtdh="http://schemas.microsoft.com/office/word/2020/wordml/sdtdatahash" xmlns:w16sdtfl="http://schemas.microsoft.com/office/word/2024/wordml/sdtformatlock" xmlns:w16se="http://schemas.microsoft.com/office/word/2015/wordml/symex" xmlns:wpg="http://schemas.microsoft.com/office/word/2010/wordprocessingGroup" xmlns:wpi="http://schemas.microsoft.com/office/word/2010/wordprocessingInk" xmlns:wne="http://schemas.microsoft.com/office/word/2006/wordml" xmlns:wps="http://schemas.microsoft.com/office/word/2010/wordprocessingShape" mc:Ignorable="w14 w15 w16se w16cid w16 w16cex w16sdtdh w16sdtfl w16du wp14">
+<w:hdr xmlns:wpc="http://schemas.microsoft.com/office/word/2010/wordprocessingCanvas" xmlns:cx="http://schemas.microsoft.com/office/drawing/2014/chartex" xmlns:cx1="http://schemas.microsoft.com/office/drawing/2015/9/8/chartex" xmlns:cx2="http://schemas.microsoft.com/office/drawing/2015/10/21/chartex" xmlns:cx3="http://schemas.microsoft.com/office/drawing/2016/5/9/chartex" xmlns:cx4="http://schemas.microsoft.com/office/drawing/2016/5/10/chartex" xmlns:cx5="http://schemas.microsoft.com/office/drawing/2016/5/11/chartex" xmlns:cx6="http://schemas.microsoft.com/office/drawing/2016/5/12/chartex" xmlns:cx7="http://schemas.microsoft.com/office/drawing/2016/5/13/chartex" xmlns:cx8="http://schemas.microsoft.com/office/drawing/2016/5/14/chartex" xmlns:mc="http://schemas.openxmlformats.org/markup-compatibility/2006" xmlns:aink="http://schemas.microsoft.com/office/drawing/2016/ink" xmlns:am3d="http://schemas.microsoft.com/office/drawing/2017/model3d" xmlns:o="urn:schemas-microsoft-com:office:office" xmlns:oel="http://schemas.microsoft.com/office/2019/extlst" xmlns:r="http://schemas.openxmlformats.org/officeDocument/2006/relationships" xmlns:m="http://schemas.openxmlformats.org/officeDocument/2006/math" xmlns:v="urn:schemas-microsoft-com:vml" xmlns:wp14="http://schemas.microsoft.com/office/word/2010/wordprocessingDrawing" xmlns:wp="http://schemas.openxmlformats.org/drawingml/2006/wordprocessingDrawing" xmlns:w10="urn:schemas-microsoft-com:office:word" xmlns:w="http://schemas.openxmlformats.org/wordprocessingml/2006/main" xmlns:w14="http://schemas.microsoft.com/office/word/2010/wordml" xmlns:w15="http://schemas.microsoft.com/office/word/2012/wordml" xmlns:w16cex="http://schemas.microsoft.com/office/word/2018/wordml/cex" xmlns:w16cid="http://schemas.microsoft.com/office/word/2016/wordml/cid" xmlns:w16="http://schemas.microsoft.com/office/word/2018/wordml" xmlns:w16du="http://schemas.microsoft.com/office/word/2023/wordml/word16du" xmlns:w16sdtdh="http://schemas.microsoft.com/office/word/2020/wordml/sdtdatahash" xmlns:w16se="http://schemas.microsoft.com/office/word/2015/wordml/symex" xmlns:wpg="http://schemas.microsoft.com/office/word/2010/wordprocessingGroup" xmlns:wpi="http://schemas.microsoft.com/office/word/2010/wordprocessingInk" xmlns:wne="http://schemas.microsoft.com/office/word/2006/wordml" xmlns:wps="http://schemas.microsoft.com/office/word/2010/wordprocessingShape" mc:Ignorable="w14 w15 w16se w16cid w16 w16cex w16sdtdh w16du wp14">
   <w:tbl>
     <w:tblPr>
       <w:tblW w:w="10508" w:type="dxa"/>
@@ -2148,7 +1890,7 @@
 </file>
 
 <file path=word/styles.xml><?xml version="1.0" encoding="utf-8"?>
-<w:styles xmlns:mc="http://schemas.openxmlformats.org/markup-compatibility/2006" xmlns:r="http://schemas.openxmlformats.org/officeDocument/2006/relationships" xmlns:w="http://schemas.openxmlformats.org/wordprocessingml/2006/main" xmlns:w14="http://schemas.microsoft.com/office/word/2010/wordml" xmlns:w15="http://schemas.microsoft.com/office/word/2012/wordml" xmlns:w16cex="http://schemas.microsoft.com/office/word/2018/wordml/cex" xmlns:w16cid="http://schemas.microsoft.com/office/word/2016/wordml/cid" xmlns:w16="http://schemas.microsoft.com/office/word/2018/wordml" xmlns:w16du="http://schemas.microsoft.com/office/word/2023/wordml/word16du" xmlns:w16sdtdh="http://schemas.microsoft.com/office/word/2020/wordml/sdtdatahash" xmlns:w16sdtfl="http://schemas.microsoft.com/office/word/2024/wordml/sdtformatlock" xmlns:w16se="http://schemas.microsoft.com/office/word/2015/wordml/symex" mc:Ignorable="w14 w15 w16se w16cid w16 w16cex w16sdtdh w16sdtfl w16du">
+<w:styles xmlns:mc="http://schemas.openxmlformats.org/markup-compatibility/2006" xmlns:r="http://schemas.openxmlformats.org/officeDocument/2006/relationships" xmlns:w="http://schemas.openxmlformats.org/wordprocessingml/2006/main" xmlns:w14="http://schemas.microsoft.com/office/word/2010/wordml" xmlns:w15="http://schemas.microsoft.com/office/word/2012/wordml" xmlns:w16cex="http://schemas.microsoft.com/office/word/2018/wordml/cex" xmlns:w16cid="http://schemas.microsoft.com/office/word/2016/wordml/cid" xmlns:w16="http://schemas.microsoft.com/office/word/2018/wordml" xmlns:w16du="http://schemas.microsoft.com/office/word/2023/wordml/word16du" xmlns:w16sdtdh="http://schemas.microsoft.com/office/word/2020/wordml/sdtdatahash" xmlns:w16se="http://schemas.microsoft.com/office/word/2015/wordml/symex" mc:Ignorable="w14 w15 w16se w16cid w16 w16cex w16sdtdh w16du">
   <w:docDefaults>
     <w:rPrDefault>
       <w:rPr>
@@ -3063,6 +2805,26 @@
 </file>
 
 <file path=customXml/item1.xml><?xml version="1.0" encoding="utf-8"?>
+<?mso-contentType ?>
+<FormTemplates xmlns="http://schemas.microsoft.com/sharepoint/v3/contenttype/forms">
+  <Display>DocumentLibraryForm</Display>
+  <Edit>DocumentLibraryForm</Edit>
+  <New>DocumentLibraryForm</New>
+</FormTemplates>
+</file>
+
+<file path=customXml/item2.xml><?xml version="1.0" encoding="utf-8"?>
+<p:properties xmlns:p="http://schemas.microsoft.com/office/2006/metadata/properties" xmlns:xsi="http://www.w3.org/2001/XMLSchema-instance" xmlns:pc="http://schemas.microsoft.com/office/infopath/2007/PartnerControls">
+  <documentManagement>
+    <lcf76f155ced4ddcb4097134ff3c332f xmlns="15c23b83-0a74-4dd8-96fd-c1cdb1965e64">
+      <Terms xmlns="http://schemas.microsoft.com/office/infopath/2007/PartnerControls"/>
+    </lcf76f155ced4ddcb4097134ff3c332f>
+    <TaxCatchAll xmlns="a9d0ce2f-9ce2-4b22-8e2a-723aa410c551" xsi:nil="true"/>
+  </documentManagement>
+</p:properties>
+</file>
+
+<file path=customXml/item3.xml><?xml version="1.0" encoding="utf-8"?>
 <ct:contentTypeSchema xmlns:ct="http://schemas.microsoft.com/office/2006/metadata/contentType" xmlns:ma="http://schemas.microsoft.com/office/2006/metadata/properties/metaAttributes" ct:_="" ma:_="" ma:contentTypeName="Documento" ma:contentTypeID="0x010100108846D5F9C3AE4C85EBCC6E9567D38C" ma:contentTypeVersion="13" ma:contentTypeDescription="Crear nuevo documento." ma:contentTypeScope="" ma:versionID="234bf719b0d5b04b273866643ddfa94d">
   <xsd:schema xmlns:xsd="http://www.w3.org/2001/XMLSchema" xmlns:xs="http://www.w3.org/2001/XMLSchema" xmlns:p="http://schemas.microsoft.com/office/2006/metadata/properties" xmlns:ns2="15c23b83-0a74-4dd8-96fd-c1cdb1965e64" xmlns:ns3="a9d0ce2f-9ce2-4b22-8e2a-723aa410c551" targetNamespace="http://schemas.microsoft.com/office/2006/metadata/properties" ma:root="true" ma:fieldsID="4d848263e9339a884436c6a48d27beb6" ns2:_="" ns3:_="">
     <xsd:import namespace="15c23b83-0a74-4dd8-96fd-c1cdb1965e64"/>
@@ -3269,27 +3031,26 @@
 </ct:contentTypeSchema>
 </file>
 
-<file path=customXml/item2.xml><?xml version="1.0" encoding="utf-8"?>
-<?mso-contentType ?>
-<FormTemplates xmlns="http://schemas.microsoft.com/sharepoint/v3/contenttype/forms">
-  <Display>DocumentLibraryForm</Display>
-  <Edit>DocumentLibraryForm</Edit>
-  <New>DocumentLibraryForm</New>
-</FormTemplates>
+<file path=customXml/itemProps1.xml><?xml version="1.0" encoding="utf-8"?>
+<ds:datastoreItem xmlns:ds="http://schemas.openxmlformats.org/officeDocument/2006/customXml" ds:itemID="{6E42620F-EA52-46A3-AF92-9188E2FB2822}">
+  <ds:schemaRefs>
+    <ds:schemaRef ds:uri="http://schemas.microsoft.com/sharepoint/v3/contenttype/forms"/>
+  </ds:schemaRefs>
+</ds:datastoreItem>
 </file>
 
-<file path=customXml/item3.xml><?xml version="1.0" encoding="utf-8"?>
-<p:properties xmlns:p="http://schemas.microsoft.com/office/2006/metadata/properties" xmlns:xsi="http://www.w3.org/2001/XMLSchema-instance" xmlns:pc="http://schemas.microsoft.com/office/infopath/2007/PartnerControls">
-  <documentManagement>
-    <lcf76f155ced4ddcb4097134ff3c332f xmlns="15c23b83-0a74-4dd8-96fd-c1cdb1965e64">
-      <Terms xmlns="http://schemas.microsoft.com/office/infopath/2007/PartnerControls"/>
-    </lcf76f155ced4ddcb4097134ff3c332f>
-    <TaxCatchAll xmlns="a9d0ce2f-9ce2-4b22-8e2a-723aa410c551" xsi:nil="true"/>
-  </documentManagement>
-</p:properties>
+<file path=customXml/itemProps2.xml><?xml version="1.0" encoding="utf-8"?>
+<ds:datastoreItem xmlns:ds="http://schemas.openxmlformats.org/officeDocument/2006/customXml" ds:itemID="{FAEC7C88-3BC7-46FB-A03C-FBCCEAD2F93D}">
+  <ds:schemaRefs>
+    <ds:schemaRef ds:uri="http://schemas.microsoft.com/office/2006/metadata/properties"/>
+    <ds:schemaRef ds:uri="http://schemas.microsoft.com/office/infopath/2007/PartnerControls"/>
+    <ds:schemaRef ds:uri="15c23b83-0a74-4dd8-96fd-c1cdb1965e64"/>
+    <ds:schemaRef ds:uri="a9d0ce2f-9ce2-4b22-8e2a-723aa410c551"/>
+  </ds:schemaRefs>
+</ds:datastoreItem>
 </file>
 
-<file path=customXml/itemProps1.xml><?xml version="1.0" encoding="utf-8"?>
+<file path=customXml/itemProps3.xml><?xml version="1.0" encoding="utf-8"?>
 <ds:datastoreItem xmlns:ds="http://schemas.openxmlformats.org/officeDocument/2006/customXml" ds:itemID="{A0AC0BCA-7724-4C8A-92DC-0D15359ECDC3}">
   <ds:schemaRefs>
     <ds:schemaRef ds:uri="http://schemas.microsoft.com/office/2006/metadata/contentType"/>
@@ -3306,23 +3067,4 @@
     <ds:schemaRef ds:uri="http://schemas.microsoft.com/internal/obd"/>
   </ds:schemaRefs>
 </ds:datastoreItem>
-</file>
-
-<file path=customXml/itemProps2.xml><?xml version="1.0" encoding="utf-8"?>
-<ds:datastoreItem xmlns:ds="http://schemas.openxmlformats.org/officeDocument/2006/customXml" ds:itemID="{6E42620F-EA52-46A3-AF92-9188E2FB2822}">
-  <ds:schemaRefs>
-    <ds:schemaRef ds:uri="http://schemas.microsoft.com/sharepoint/v3/contenttype/forms"/>
-  </ds:schemaRefs>
-</ds:datastoreItem>
-</file>
-
-<file path=customXml/itemProps3.xml><?xml version="1.0" encoding="utf-8"?>
-<ds:datastoreItem xmlns:ds="http://schemas.openxmlformats.org/officeDocument/2006/customXml" ds:itemID="{FAEC7C88-3BC7-46FB-A03C-FBCCEAD2F93D}">
-  <ds:schemaRefs>
-    <ds:schemaRef ds:uri="http://schemas.microsoft.com/office/2006/metadata/properties"/>
-    <ds:schemaRef ds:uri="http://schemas.microsoft.com/office/infopath/2007/PartnerControls"/>
-    <ds:schemaRef ds:uri="15c23b83-0a74-4dd8-96fd-c1cdb1965e64"/>
-    <ds:schemaRef ds:uri="a9d0ce2f-9ce2-4b22-8e2a-723aa410c551"/>
-  </ds:schemaRefs>
-</ds:datastoreItem>
 </file>
</xml_diff>

<commit_message>
Informe de avance mayo firmado
</commit_message>
<xml_diff>
--- a/1023630560, SAMUEL LÓPEZ, IA.docx
+++ b/1023630560, SAMUEL LÓPEZ, IA.docx
@@ -1,6 +1,6 @@
 
 <file path=word/document.xml><?xml version="1.0" encoding="utf-8"?>
-<w:document xmlns:wpc="http://schemas.microsoft.com/office/word/2010/wordprocessingCanvas" xmlns:cx="http://schemas.microsoft.com/office/drawing/2014/chartex" xmlns:cx1="http://schemas.microsoft.com/office/drawing/2015/9/8/chartex" xmlns:cx2="http://schemas.microsoft.com/office/drawing/2015/10/21/chartex" xmlns:cx3="http://schemas.microsoft.com/office/drawing/2016/5/9/chartex" xmlns:cx4="http://schemas.microsoft.com/office/drawing/2016/5/10/chartex" xmlns:cx5="http://schemas.microsoft.com/office/drawing/2016/5/11/chartex" xmlns:cx6="http://schemas.microsoft.com/office/drawing/2016/5/12/chartex" xmlns:cx7="http://schemas.microsoft.com/office/drawing/2016/5/13/chartex" xmlns:cx8="http://schemas.microsoft.com/office/drawing/2016/5/14/chartex" xmlns:mc="http://schemas.openxmlformats.org/markup-compatibility/2006" xmlns:aink="http://schemas.microsoft.com/office/drawing/2016/ink" xmlns:am3d="http://schemas.microsoft.com/office/drawing/2017/model3d" xmlns:o="urn:schemas-microsoft-com:office:office" xmlns:oel="http://schemas.microsoft.com/office/2019/extlst" xmlns:r="http://schemas.openxmlformats.org/officeDocument/2006/relationships" xmlns:m="http://schemas.openxmlformats.org/officeDocument/2006/math" xmlns:v="urn:schemas-microsoft-com:vml" xmlns:wp14="http://schemas.microsoft.com/office/word/2010/wordprocessingDrawing" xmlns:wp="http://schemas.openxmlformats.org/drawingml/2006/wordprocessingDrawing" xmlns:w10="urn:schemas-microsoft-com:office:word" xmlns:w="http://schemas.openxmlformats.org/wordprocessingml/2006/main" xmlns:w14="http://schemas.microsoft.com/office/word/2010/wordml" xmlns:w15="http://schemas.microsoft.com/office/word/2012/wordml" xmlns:w16cex="http://schemas.microsoft.com/office/word/2018/wordml/cex" xmlns:w16cid="http://schemas.microsoft.com/office/word/2016/wordml/cid" xmlns:w16="http://schemas.microsoft.com/office/word/2018/wordml" xmlns:w16du="http://schemas.microsoft.com/office/word/2023/wordml/word16du" xmlns:w16sdtdh="http://schemas.microsoft.com/office/word/2020/wordml/sdtdatahash" xmlns:w16se="http://schemas.microsoft.com/office/word/2015/wordml/symex" xmlns:wpg="http://schemas.microsoft.com/office/word/2010/wordprocessingGroup" xmlns:wpi="http://schemas.microsoft.com/office/word/2010/wordprocessingInk" xmlns:wne="http://schemas.microsoft.com/office/word/2006/wordml" xmlns:wps="http://schemas.microsoft.com/office/word/2010/wordprocessingShape" mc:Ignorable="w14 w15 w16se w16cid w16 w16cex w16sdtdh w16du wp14">
+<w:document xmlns:wpc="http://schemas.microsoft.com/office/word/2010/wordprocessingCanvas" xmlns:cx="http://schemas.microsoft.com/office/drawing/2014/chartex" xmlns:cx1="http://schemas.microsoft.com/office/drawing/2015/9/8/chartex" xmlns:cx2="http://schemas.microsoft.com/office/drawing/2015/10/21/chartex" xmlns:cx3="http://schemas.microsoft.com/office/drawing/2016/5/9/chartex" xmlns:cx4="http://schemas.microsoft.com/office/drawing/2016/5/10/chartex" xmlns:cx5="http://schemas.microsoft.com/office/drawing/2016/5/11/chartex" xmlns:cx6="http://schemas.microsoft.com/office/drawing/2016/5/12/chartex" xmlns:cx7="http://schemas.microsoft.com/office/drawing/2016/5/13/chartex" xmlns:cx8="http://schemas.microsoft.com/office/drawing/2016/5/14/chartex" xmlns:mc="http://schemas.openxmlformats.org/markup-compatibility/2006" xmlns:aink="http://schemas.microsoft.com/office/drawing/2016/ink" xmlns:am3d="http://schemas.microsoft.com/office/drawing/2017/model3d" xmlns:o="urn:schemas-microsoft-com:office:office" xmlns:oel="http://schemas.microsoft.com/office/2019/extlst" xmlns:r="http://schemas.openxmlformats.org/officeDocument/2006/relationships" xmlns:m="http://schemas.openxmlformats.org/officeDocument/2006/math" xmlns:v="urn:schemas-microsoft-com:vml" xmlns:wp14="http://schemas.microsoft.com/office/word/2010/wordprocessingDrawing" xmlns:wp="http://schemas.openxmlformats.org/drawingml/2006/wordprocessingDrawing" xmlns:w10="urn:schemas-microsoft-com:office:word" xmlns:w="http://schemas.openxmlformats.org/wordprocessingml/2006/main" xmlns:w14="http://schemas.microsoft.com/office/word/2010/wordml" xmlns:w15="http://schemas.microsoft.com/office/word/2012/wordml" xmlns:w16cex="http://schemas.microsoft.com/office/word/2018/wordml/cex" xmlns:w16cid="http://schemas.microsoft.com/office/word/2016/wordml/cid" xmlns:w16="http://schemas.microsoft.com/office/word/2018/wordml" xmlns:w16du="http://schemas.microsoft.com/office/word/2023/wordml/word16du" xmlns:w16sdtdh="http://schemas.microsoft.com/office/word/2020/wordml/sdtdatahash" xmlns:w16sdtfl="http://schemas.microsoft.com/office/word/2024/wordml/sdtformatlock" xmlns:w16se="http://schemas.microsoft.com/office/word/2015/wordml/symex" xmlns:wpg="http://schemas.microsoft.com/office/word/2010/wordprocessingGroup" xmlns:wpi="http://schemas.microsoft.com/office/word/2010/wordprocessingInk" xmlns:wne="http://schemas.microsoft.com/office/word/2006/wordml" xmlns:wps="http://schemas.microsoft.com/office/word/2010/wordprocessingShape" mc:Ignorable="w14 w15 w16se w16cid w16 w16cex w16sdtdh w16sdtfl w16du wp14">
   <w:body>
     <w:tbl>
       <w:tblPr>
@@ -1090,6 +1090,14 @@
                 <w:szCs w:val="20"/>
               </w:rPr>
             </w:pPr>
+            <w:r>
+              <w:rPr>
+                <w:rFonts w:asciiTheme="minorHAnsi" w:hAnsiTheme="minorHAnsi" w:cstheme="minorHAnsi"/>
+                <w:sz w:val="20"/>
+                <w:szCs w:val="20"/>
+              </w:rPr>
+              <w:t>El estudiante ha presentado avances significativos.</w:t>
+            </w:r>
           </w:p>
           <w:p>
             <w:pPr>
@@ -1163,7 +1171,7 @@
           <w:u w:val="single"/>
         </w:rPr>
         <w:drawing>
-          <wp:inline distT="0" distB="0" distL="0" distR="0" wp14:anchorId="7EF4A5F4" wp14:editId="4F68B4FD">
+          <wp:inline distT="0" distB="0" distL="0" distR="0" wp14:anchorId="7EF4A5F4" wp14:editId="237E87EB">
             <wp:extent cx="1409700" cy="679496"/>
             <wp:effectExtent l="0" t="0" r="0" b="0"/>
             <wp:docPr id="1395513098" name="Imagen 1"/>
@@ -1263,6 +1271,56 @@
       <w:r>
         <w:rPr>
           <w:rFonts w:asciiTheme="minorHAnsi" w:hAnsiTheme="minorHAnsi" w:cstheme="minorHAnsi"/>
+          <w:noProof/>
+          <w:sz w:val="20"/>
+          <w:szCs w:val="20"/>
+          <w:u w:val="single"/>
+        </w:rPr>
+        <w:drawing>
+          <wp:inline distT="0" distB="0" distL="0" distR="0" wp14:anchorId="395C0700" wp14:editId="20381B5D">
+            <wp:extent cx="1826591" cy="528407"/>
+            <wp:effectExtent l="0" t="0" r="2540" b="5080"/>
+            <wp:docPr id="1417742677" name="Imagen 1"/>
+            <wp:cNvGraphicFramePr>
+              <a:graphicFrameLocks xmlns:a="http://schemas.openxmlformats.org/drawingml/2006/main" noChangeAspect="1"/>
+            </wp:cNvGraphicFramePr>
+            <a:graphic xmlns:a="http://schemas.openxmlformats.org/drawingml/2006/main">
+              <a:graphicData uri="http://schemas.openxmlformats.org/drawingml/2006/picture">
+                <pic:pic xmlns:pic="http://schemas.openxmlformats.org/drawingml/2006/picture">
+                  <pic:nvPicPr>
+                    <pic:cNvPr id="1417742677" name="Imagen 1417742677"/>
+                    <pic:cNvPicPr/>
+                  </pic:nvPicPr>
+                  <pic:blipFill>
+                    <a:blip r:embed="rId10">
+                      <a:extLst>
+                        <a:ext uri="{28A0092B-C50C-407E-A947-70E740481C1C}">
+                          <a14:useLocalDpi xmlns:a14="http://schemas.microsoft.com/office/drawing/2010/main" val="0"/>
+                        </a:ext>
+                      </a:extLst>
+                    </a:blip>
+                    <a:stretch>
+                      <a:fillRect/>
+                    </a:stretch>
+                  </pic:blipFill>
+                  <pic:spPr>
+                    <a:xfrm>
+                      <a:off x="0" y="0"/>
+                      <a:ext cx="1949509" cy="563966"/>
+                    </a:xfrm>
+                    <a:prstGeom prst="rect">
+                      <a:avLst/>
+                    </a:prstGeom>
+                  </pic:spPr>
+                </pic:pic>
+              </a:graphicData>
+            </a:graphic>
+          </wp:inline>
+        </w:drawing>
+      </w:r>
+      <w:r>
+        <w:rPr>
+          <w:rFonts w:asciiTheme="minorHAnsi" w:hAnsiTheme="minorHAnsi" w:cstheme="minorHAnsi"/>
           <w:sz w:val="20"/>
           <w:szCs w:val="20"/>
           <w:u w:val="single"/>
@@ -1421,7 +1479,7 @@
       </w:pPr>
     </w:p>
     <w:sectPr>
-      <w:headerReference w:type="default" r:id="rId10"/>
+      <w:headerReference w:type="default" r:id="rId11"/>
       <w:pgSz w:w="12240" w:h="15840"/>
       <w:pgMar w:top="1701" w:right="1134" w:bottom="1701" w:left="1134" w:header="709" w:footer="709" w:gutter="0"/>
       <w:cols w:space="708"/>
@@ -1432,7 +1490,7 @@
 </file>
 
 <file path=word/endnotes.xml><?xml version="1.0" encoding="utf-8"?>
-<w:endnotes xmlns:wpc="http://schemas.microsoft.com/office/word/2010/wordprocessingCanvas" xmlns:cx="http://schemas.microsoft.com/office/drawing/2014/chartex" xmlns:cx1="http://schemas.microsoft.com/office/drawing/2015/9/8/chartex" xmlns:cx2="http://schemas.microsoft.com/office/drawing/2015/10/21/chartex" xmlns:cx3="http://schemas.microsoft.com/office/drawing/2016/5/9/chartex" xmlns:cx4="http://schemas.microsoft.com/office/drawing/2016/5/10/chartex" xmlns:cx5="http://schemas.microsoft.com/office/drawing/2016/5/11/chartex" xmlns:cx6="http://schemas.microsoft.com/office/drawing/2016/5/12/chartex" xmlns:cx7="http://schemas.microsoft.com/office/drawing/2016/5/13/chartex" xmlns:cx8="http://schemas.microsoft.com/office/drawing/2016/5/14/chartex" xmlns:mc="http://schemas.openxmlformats.org/markup-compatibility/2006" xmlns:aink="http://schemas.microsoft.com/office/drawing/2016/ink" xmlns:am3d="http://schemas.microsoft.com/office/drawing/2017/model3d" xmlns:o="urn:schemas-microsoft-com:office:office" xmlns:oel="http://schemas.microsoft.com/office/2019/extlst" xmlns:r="http://schemas.openxmlformats.org/officeDocument/2006/relationships" xmlns:m="http://schemas.openxmlformats.org/officeDocument/2006/math" xmlns:v="urn:schemas-microsoft-com:vml" xmlns:wp14="http://schemas.microsoft.com/office/word/2010/wordprocessingDrawing" xmlns:wp="http://schemas.openxmlformats.org/drawingml/2006/wordprocessingDrawing" xmlns:w10="urn:schemas-microsoft-com:office:word" xmlns:w="http://schemas.openxmlformats.org/wordprocessingml/2006/main" xmlns:w14="http://schemas.microsoft.com/office/word/2010/wordml" xmlns:w15="http://schemas.microsoft.com/office/word/2012/wordml" xmlns:w16cex="http://schemas.microsoft.com/office/word/2018/wordml/cex" xmlns:w16cid="http://schemas.microsoft.com/office/word/2016/wordml/cid" xmlns:w16="http://schemas.microsoft.com/office/word/2018/wordml" xmlns:w16du="http://schemas.microsoft.com/office/word/2023/wordml/word16du" xmlns:w16sdtdh="http://schemas.microsoft.com/office/word/2020/wordml/sdtdatahash" xmlns:w16se="http://schemas.microsoft.com/office/word/2015/wordml/symex" xmlns:wpg="http://schemas.microsoft.com/office/word/2010/wordprocessingGroup" xmlns:wpi="http://schemas.microsoft.com/office/word/2010/wordprocessingInk" xmlns:wne="http://schemas.microsoft.com/office/word/2006/wordml" xmlns:wps="http://schemas.microsoft.com/office/word/2010/wordprocessingShape" mc:Ignorable="w14 w15 w16se w16cid w16 w16cex w16sdtdh w16du wp14">
+<w:endnotes xmlns:wpc="http://schemas.microsoft.com/office/word/2010/wordprocessingCanvas" xmlns:cx="http://schemas.microsoft.com/office/drawing/2014/chartex" xmlns:cx1="http://schemas.microsoft.com/office/drawing/2015/9/8/chartex" xmlns:cx2="http://schemas.microsoft.com/office/drawing/2015/10/21/chartex" xmlns:cx3="http://schemas.microsoft.com/office/drawing/2016/5/9/chartex" xmlns:cx4="http://schemas.microsoft.com/office/drawing/2016/5/10/chartex" xmlns:cx5="http://schemas.microsoft.com/office/drawing/2016/5/11/chartex" xmlns:cx6="http://schemas.microsoft.com/office/drawing/2016/5/12/chartex" xmlns:cx7="http://schemas.microsoft.com/office/drawing/2016/5/13/chartex" xmlns:cx8="http://schemas.microsoft.com/office/drawing/2016/5/14/chartex" xmlns:mc="http://schemas.openxmlformats.org/markup-compatibility/2006" xmlns:aink="http://schemas.microsoft.com/office/drawing/2016/ink" xmlns:am3d="http://schemas.microsoft.com/office/drawing/2017/model3d" xmlns:o="urn:schemas-microsoft-com:office:office" xmlns:oel="http://schemas.microsoft.com/office/2019/extlst" xmlns:r="http://schemas.openxmlformats.org/officeDocument/2006/relationships" xmlns:m="http://schemas.openxmlformats.org/officeDocument/2006/math" xmlns:v="urn:schemas-microsoft-com:vml" xmlns:wp14="http://schemas.microsoft.com/office/word/2010/wordprocessingDrawing" xmlns:wp="http://schemas.openxmlformats.org/drawingml/2006/wordprocessingDrawing" xmlns:w10="urn:schemas-microsoft-com:office:word" xmlns:w="http://schemas.openxmlformats.org/wordprocessingml/2006/main" xmlns:w14="http://schemas.microsoft.com/office/word/2010/wordml" xmlns:w15="http://schemas.microsoft.com/office/word/2012/wordml" xmlns:w16cex="http://schemas.microsoft.com/office/word/2018/wordml/cex" xmlns:w16cid="http://schemas.microsoft.com/office/word/2016/wordml/cid" xmlns:w16="http://schemas.microsoft.com/office/word/2018/wordml" xmlns:w16du="http://schemas.microsoft.com/office/word/2023/wordml/word16du" xmlns:w16sdtdh="http://schemas.microsoft.com/office/word/2020/wordml/sdtdatahash" xmlns:w16sdtfl="http://schemas.microsoft.com/office/word/2024/wordml/sdtformatlock" xmlns:w16se="http://schemas.microsoft.com/office/word/2015/wordml/symex" xmlns:wpg="http://schemas.microsoft.com/office/word/2010/wordprocessingGroup" xmlns:wpi="http://schemas.microsoft.com/office/word/2010/wordprocessingInk" xmlns:wne="http://schemas.microsoft.com/office/word/2006/wordml" xmlns:wps="http://schemas.microsoft.com/office/word/2010/wordprocessingShape" mc:Ignorable="w14 w15 w16se w16cid w16 w16cex w16sdtdh w16sdtfl w16du wp14">
   <w:endnote w:type="separator" w:id="-1">
     <w:p>
       <w:pPr>
@@ -1457,7 +1515,7 @@
 </file>
 
 <file path=word/footnotes.xml><?xml version="1.0" encoding="utf-8"?>
-<w:footnotes xmlns:wpc="http://schemas.microsoft.com/office/word/2010/wordprocessingCanvas" xmlns:cx="http://schemas.microsoft.com/office/drawing/2014/chartex" xmlns:cx1="http://schemas.microsoft.com/office/drawing/2015/9/8/chartex" xmlns:cx2="http://schemas.microsoft.com/office/drawing/2015/10/21/chartex" xmlns:cx3="http://schemas.microsoft.com/office/drawing/2016/5/9/chartex" xmlns:cx4="http://schemas.microsoft.com/office/drawing/2016/5/10/chartex" xmlns:cx5="http://schemas.microsoft.com/office/drawing/2016/5/11/chartex" xmlns:cx6="http://schemas.microsoft.com/office/drawing/2016/5/12/chartex" xmlns:cx7="http://schemas.microsoft.com/office/drawing/2016/5/13/chartex" xmlns:cx8="http://schemas.microsoft.com/office/drawing/2016/5/14/chartex" xmlns:mc="http://schemas.openxmlformats.org/markup-compatibility/2006" xmlns:aink="http://schemas.microsoft.com/office/drawing/2016/ink" xmlns:am3d="http://schemas.microsoft.com/office/drawing/2017/model3d" xmlns:o="urn:schemas-microsoft-com:office:office" xmlns:oel="http://schemas.microsoft.com/office/2019/extlst" xmlns:r="http://schemas.openxmlformats.org/officeDocument/2006/relationships" xmlns:m="http://schemas.openxmlformats.org/officeDocument/2006/math" xmlns:v="urn:schemas-microsoft-com:vml" xmlns:wp14="http://schemas.microsoft.com/office/word/2010/wordprocessingDrawing" xmlns:wp="http://schemas.openxmlformats.org/drawingml/2006/wordprocessingDrawing" xmlns:w10="urn:schemas-microsoft-com:office:word" xmlns:w="http://schemas.openxmlformats.org/wordprocessingml/2006/main" xmlns:w14="http://schemas.microsoft.com/office/word/2010/wordml" xmlns:w15="http://schemas.microsoft.com/office/word/2012/wordml" xmlns:w16cex="http://schemas.microsoft.com/office/word/2018/wordml/cex" xmlns:w16cid="http://schemas.microsoft.com/office/word/2016/wordml/cid" xmlns:w16="http://schemas.microsoft.com/office/word/2018/wordml" xmlns:w16du="http://schemas.microsoft.com/office/word/2023/wordml/word16du" xmlns:w16sdtdh="http://schemas.microsoft.com/office/word/2020/wordml/sdtdatahash" xmlns:w16se="http://schemas.microsoft.com/office/word/2015/wordml/symex" xmlns:wpg="http://schemas.microsoft.com/office/word/2010/wordprocessingGroup" xmlns:wpi="http://schemas.microsoft.com/office/word/2010/wordprocessingInk" xmlns:wne="http://schemas.microsoft.com/office/word/2006/wordml" xmlns:wps="http://schemas.microsoft.com/office/word/2010/wordprocessingShape" mc:Ignorable="w14 w15 w16se w16cid w16 w16cex w16sdtdh w16du wp14">
+<w:footnotes xmlns:wpc="http://schemas.microsoft.com/office/word/2010/wordprocessingCanvas" xmlns:cx="http://schemas.microsoft.com/office/drawing/2014/chartex" xmlns:cx1="http://schemas.microsoft.com/office/drawing/2015/9/8/chartex" xmlns:cx2="http://schemas.microsoft.com/office/drawing/2015/10/21/chartex" xmlns:cx3="http://schemas.microsoft.com/office/drawing/2016/5/9/chartex" xmlns:cx4="http://schemas.microsoft.com/office/drawing/2016/5/10/chartex" xmlns:cx5="http://schemas.microsoft.com/office/drawing/2016/5/11/chartex" xmlns:cx6="http://schemas.microsoft.com/office/drawing/2016/5/12/chartex" xmlns:cx7="http://schemas.microsoft.com/office/drawing/2016/5/13/chartex" xmlns:cx8="http://schemas.microsoft.com/office/drawing/2016/5/14/chartex" xmlns:mc="http://schemas.openxmlformats.org/markup-compatibility/2006" xmlns:aink="http://schemas.microsoft.com/office/drawing/2016/ink" xmlns:am3d="http://schemas.microsoft.com/office/drawing/2017/model3d" xmlns:o="urn:schemas-microsoft-com:office:office" xmlns:oel="http://schemas.microsoft.com/office/2019/extlst" xmlns:r="http://schemas.openxmlformats.org/officeDocument/2006/relationships" xmlns:m="http://schemas.openxmlformats.org/officeDocument/2006/math" xmlns:v="urn:schemas-microsoft-com:vml" xmlns:wp14="http://schemas.microsoft.com/office/word/2010/wordprocessingDrawing" xmlns:wp="http://schemas.openxmlformats.org/drawingml/2006/wordprocessingDrawing" xmlns:w10="urn:schemas-microsoft-com:office:word" xmlns:w="http://schemas.openxmlformats.org/wordprocessingml/2006/main" xmlns:w14="http://schemas.microsoft.com/office/word/2010/wordml" xmlns:w15="http://schemas.microsoft.com/office/word/2012/wordml" xmlns:w16cex="http://schemas.microsoft.com/office/word/2018/wordml/cex" xmlns:w16cid="http://schemas.microsoft.com/office/word/2016/wordml/cid" xmlns:w16="http://schemas.microsoft.com/office/word/2018/wordml" xmlns:w16du="http://schemas.microsoft.com/office/word/2023/wordml/word16du" xmlns:w16sdtdh="http://schemas.microsoft.com/office/word/2020/wordml/sdtdatahash" xmlns:w16sdtfl="http://schemas.microsoft.com/office/word/2024/wordml/sdtformatlock" xmlns:w16se="http://schemas.microsoft.com/office/word/2015/wordml/symex" xmlns:wpg="http://schemas.microsoft.com/office/word/2010/wordprocessingGroup" xmlns:wpi="http://schemas.microsoft.com/office/word/2010/wordprocessingInk" xmlns:wne="http://schemas.microsoft.com/office/word/2006/wordml" xmlns:wps="http://schemas.microsoft.com/office/word/2010/wordprocessingShape" mc:Ignorable="w14 w15 w16se w16cid w16 w16cex w16sdtdh w16sdtfl w16du wp14">
   <w:footnote w:type="separator" w:id="-1">
     <w:p>
       <w:pPr>
@@ -1482,7 +1540,7 @@
 </file>
 
 <file path=word/header1.xml><?xml version="1.0" encoding="utf-8"?>
-<w:hdr xmlns:wpc="http://schemas.microsoft.com/office/word/2010/wordprocessingCanvas" xmlns:cx="http://schemas.microsoft.com/office/drawing/2014/chartex" xmlns:cx1="http://schemas.microsoft.com/office/drawing/2015/9/8/chartex" xmlns:cx2="http://schemas.microsoft.com/office/drawing/2015/10/21/chartex" xmlns:cx3="http://schemas.microsoft.com/office/drawing/2016/5/9/chartex" xmlns:cx4="http://schemas.microsoft.com/office/drawing/2016/5/10/chartex" xmlns:cx5="http://schemas.microsoft.com/office/drawing/2016/5/11/chartex" xmlns:cx6="http://schemas.microsoft.com/office/drawing/2016/5/12/chartex" xmlns:cx7="http://schemas.microsoft.com/office/drawing/2016/5/13/chartex" xmlns:cx8="http://schemas.microsoft.com/office/drawing/2016/5/14/chartex" xmlns:mc="http://schemas.openxmlformats.org/markup-compatibility/2006" xmlns:aink="http://schemas.microsoft.com/office/drawing/2016/ink" xmlns:am3d="http://schemas.microsoft.com/office/drawing/2017/model3d" xmlns:o="urn:schemas-microsoft-com:office:office" xmlns:oel="http://schemas.microsoft.com/office/2019/extlst" xmlns:r="http://schemas.openxmlformats.org/officeDocument/2006/relationships" xmlns:m="http://schemas.openxmlformats.org/officeDocument/2006/math" xmlns:v="urn:schemas-microsoft-com:vml" xmlns:wp14="http://schemas.microsoft.com/office/word/2010/wordprocessingDrawing" xmlns:wp="http://schemas.openxmlformats.org/drawingml/2006/wordprocessingDrawing" xmlns:w10="urn:schemas-microsoft-com:office:word" xmlns:w="http://schemas.openxmlformats.org/wordprocessingml/2006/main" xmlns:w14="http://schemas.microsoft.com/office/word/2010/wordml" xmlns:w15="http://schemas.microsoft.com/office/word/2012/wordml" xmlns:w16cex="http://schemas.microsoft.com/office/word/2018/wordml/cex" xmlns:w16cid="http://schemas.microsoft.com/office/word/2016/wordml/cid" xmlns:w16="http://schemas.microsoft.com/office/word/2018/wordml" xmlns:w16du="http://schemas.microsoft.com/office/word/2023/wordml/word16du" xmlns:w16sdtdh="http://schemas.microsoft.com/office/word/2020/wordml/sdtdatahash" xmlns:w16se="http://schemas.microsoft.com/office/word/2015/wordml/symex" xmlns:wpg="http://schemas.microsoft.com/office/word/2010/wordprocessingGroup" xmlns:wpi="http://schemas.microsoft.com/office/word/2010/wordprocessingInk" xmlns:wne="http://schemas.microsoft.com/office/word/2006/wordml" xmlns:wps="http://schemas.microsoft.com/office/word/2010/wordprocessingShape" mc:Ignorable="w14 w15 w16se w16cid w16 w16cex w16sdtdh w16du wp14">
+<w:hdr xmlns:wpc="http://schemas.microsoft.com/office/word/2010/wordprocessingCanvas" xmlns:cx="http://schemas.microsoft.com/office/drawing/2014/chartex" xmlns:cx1="http://schemas.microsoft.com/office/drawing/2015/9/8/chartex" xmlns:cx2="http://schemas.microsoft.com/office/drawing/2015/10/21/chartex" xmlns:cx3="http://schemas.microsoft.com/office/drawing/2016/5/9/chartex" xmlns:cx4="http://schemas.microsoft.com/office/drawing/2016/5/10/chartex" xmlns:cx5="http://schemas.microsoft.com/office/drawing/2016/5/11/chartex" xmlns:cx6="http://schemas.microsoft.com/office/drawing/2016/5/12/chartex" xmlns:cx7="http://schemas.microsoft.com/office/drawing/2016/5/13/chartex" xmlns:cx8="http://schemas.microsoft.com/office/drawing/2016/5/14/chartex" xmlns:mc="http://schemas.openxmlformats.org/markup-compatibility/2006" xmlns:aink="http://schemas.microsoft.com/office/drawing/2016/ink" xmlns:am3d="http://schemas.microsoft.com/office/drawing/2017/model3d" xmlns:o="urn:schemas-microsoft-com:office:office" xmlns:oel="http://schemas.microsoft.com/office/2019/extlst" xmlns:r="http://schemas.openxmlformats.org/officeDocument/2006/relationships" xmlns:m="http://schemas.openxmlformats.org/officeDocument/2006/math" xmlns:v="urn:schemas-microsoft-com:vml" xmlns:wp14="http://schemas.microsoft.com/office/word/2010/wordprocessingDrawing" xmlns:wp="http://schemas.openxmlformats.org/drawingml/2006/wordprocessingDrawing" xmlns:w10="urn:schemas-microsoft-com:office:word" xmlns:w="http://schemas.openxmlformats.org/wordprocessingml/2006/main" xmlns:w14="http://schemas.microsoft.com/office/word/2010/wordml" xmlns:w15="http://schemas.microsoft.com/office/word/2012/wordml" xmlns:w16cex="http://schemas.microsoft.com/office/word/2018/wordml/cex" xmlns:w16cid="http://schemas.microsoft.com/office/word/2016/wordml/cid" xmlns:w16="http://schemas.microsoft.com/office/word/2018/wordml" xmlns:w16du="http://schemas.microsoft.com/office/word/2023/wordml/word16du" xmlns:w16sdtdh="http://schemas.microsoft.com/office/word/2020/wordml/sdtdatahash" xmlns:w16sdtfl="http://schemas.microsoft.com/office/word/2024/wordml/sdtformatlock" xmlns:w16se="http://schemas.microsoft.com/office/word/2015/wordml/symex" xmlns:wpg="http://schemas.microsoft.com/office/word/2010/wordprocessingGroup" xmlns:wpi="http://schemas.microsoft.com/office/word/2010/wordprocessingInk" xmlns:wne="http://schemas.microsoft.com/office/word/2006/wordml" xmlns:wps="http://schemas.microsoft.com/office/word/2010/wordprocessingShape" mc:Ignorable="w14 w15 w16se w16cid w16 w16cex w16sdtdh w16sdtfl w16du wp14">
   <w:tbl>
     <w:tblPr>
       <w:tblW w:w="10508" w:type="dxa"/>
@@ -1890,7 +1948,7 @@
 </file>
 
 <file path=word/styles.xml><?xml version="1.0" encoding="utf-8"?>
-<w:styles xmlns:mc="http://schemas.openxmlformats.org/markup-compatibility/2006" xmlns:r="http://schemas.openxmlformats.org/officeDocument/2006/relationships" xmlns:w="http://schemas.openxmlformats.org/wordprocessingml/2006/main" xmlns:w14="http://schemas.microsoft.com/office/word/2010/wordml" xmlns:w15="http://schemas.microsoft.com/office/word/2012/wordml" xmlns:w16cex="http://schemas.microsoft.com/office/word/2018/wordml/cex" xmlns:w16cid="http://schemas.microsoft.com/office/word/2016/wordml/cid" xmlns:w16="http://schemas.microsoft.com/office/word/2018/wordml" xmlns:w16du="http://schemas.microsoft.com/office/word/2023/wordml/word16du" xmlns:w16sdtdh="http://schemas.microsoft.com/office/word/2020/wordml/sdtdatahash" xmlns:w16se="http://schemas.microsoft.com/office/word/2015/wordml/symex" mc:Ignorable="w14 w15 w16se w16cid w16 w16cex w16sdtdh w16du">
+<w:styles xmlns:mc="http://schemas.openxmlformats.org/markup-compatibility/2006" xmlns:r="http://schemas.openxmlformats.org/officeDocument/2006/relationships" xmlns:w="http://schemas.openxmlformats.org/wordprocessingml/2006/main" xmlns:w14="http://schemas.microsoft.com/office/word/2010/wordml" xmlns:w15="http://schemas.microsoft.com/office/word/2012/wordml" xmlns:w16cex="http://schemas.microsoft.com/office/word/2018/wordml/cex" xmlns:w16cid="http://schemas.microsoft.com/office/word/2016/wordml/cid" xmlns:w16="http://schemas.microsoft.com/office/word/2018/wordml" xmlns:w16du="http://schemas.microsoft.com/office/word/2023/wordml/word16du" xmlns:w16sdtdh="http://schemas.microsoft.com/office/word/2020/wordml/sdtdatahash" xmlns:w16sdtfl="http://schemas.microsoft.com/office/word/2024/wordml/sdtformatlock" xmlns:w16se="http://schemas.microsoft.com/office/word/2015/wordml/symex" mc:Ignorable="w14 w15 w16se w16cid w16 w16cex w16sdtdh w16sdtfl w16du">
   <w:docDefaults>
     <w:rPrDefault>
       <w:rPr>
@@ -2805,26 +2863,6 @@
 </file>
 
 <file path=customXml/item1.xml><?xml version="1.0" encoding="utf-8"?>
-<?mso-contentType ?>
-<FormTemplates xmlns="http://schemas.microsoft.com/sharepoint/v3/contenttype/forms">
-  <Display>DocumentLibraryForm</Display>
-  <Edit>DocumentLibraryForm</Edit>
-  <New>DocumentLibraryForm</New>
-</FormTemplates>
-</file>
-
-<file path=customXml/item2.xml><?xml version="1.0" encoding="utf-8"?>
-<p:properties xmlns:p="http://schemas.microsoft.com/office/2006/metadata/properties" xmlns:xsi="http://www.w3.org/2001/XMLSchema-instance" xmlns:pc="http://schemas.microsoft.com/office/infopath/2007/PartnerControls">
-  <documentManagement>
-    <lcf76f155ced4ddcb4097134ff3c332f xmlns="15c23b83-0a74-4dd8-96fd-c1cdb1965e64">
-      <Terms xmlns="http://schemas.microsoft.com/office/infopath/2007/PartnerControls"/>
-    </lcf76f155ced4ddcb4097134ff3c332f>
-    <TaxCatchAll xmlns="a9d0ce2f-9ce2-4b22-8e2a-723aa410c551" xsi:nil="true"/>
-  </documentManagement>
-</p:properties>
-</file>
-
-<file path=customXml/item3.xml><?xml version="1.0" encoding="utf-8"?>
 <ct:contentTypeSchema xmlns:ct="http://schemas.microsoft.com/office/2006/metadata/contentType" xmlns:ma="http://schemas.microsoft.com/office/2006/metadata/properties/metaAttributes" ct:_="" ma:_="" ma:contentTypeName="Documento" ma:contentTypeID="0x010100108846D5F9C3AE4C85EBCC6E9567D38C" ma:contentTypeVersion="13" ma:contentTypeDescription="Crear nuevo documento." ma:contentTypeScope="" ma:versionID="234bf719b0d5b04b273866643ddfa94d">
   <xsd:schema xmlns:xsd="http://www.w3.org/2001/XMLSchema" xmlns:xs="http://www.w3.org/2001/XMLSchema" xmlns:p="http://schemas.microsoft.com/office/2006/metadata/properties" xmlns:ns2="15c23b83-0a74-4dd8-96fd-c1cdb1965e64" xmlns:ns3="a9d0ce2f-9ce2-4b22-8e2a-723aa410c551" targetNamespace="http://schemas.microsoft.com/office/2006/metadata/properties" ma:root="true" ma:fieldsID="4d848263e9339a884436c6a48d27beb6" ns2:_="" ns3:_="">
     <xsd:import namespace="15c23b83-0a74-4dd8-96fd-c1cdb1965e64"/>
@@ -3031,10 +3069,41 @@
 </ct:contentTypeSchema>
 </file>
 
+<file path=customXml/item2.xml><?xml version="1.0" encoding="utf-8"?>
+<p:properties xmlns:p="http://schemas.microsoft.com/office/2006/metadata/properties" xmlns:xsi="http://www.w3.org/2001/XMLSchema-instance" xmlns:pc="http://schemas.microsoft.com/office/infopath/2007/PartnerControls">
+  <documentManagement>
+    <lcf76f155ced4ddcb4097134ff3c332f xmlns="15c23b83-0a74-4dd8-96fd-c1cdb1965e64">
+      <Terms xmlns="http://schemas.microsoft.com/office/infopath/2007/PartnerControls"/>
+    </lcf76f155ced4ddcb4097134ff3c332f>
+    <TaxCatchAll xmlns="a9d0ce2f-9ce2-4b22-8e2a-723aa410c551" xsi:nil="true"/>
+  </documentManagement>
+</p:properties>
+</file>
+
+<file path=customXml/item3.xml><?xml version="1.0" encoding="utf-8"?>
+<?mso-contentType ?>
+<FormTemplates xmlns="http://schemas.microsoft.com/sharepoint/v3/contenttype/forms">
+  <Display>DocumentLibraryForm</Display>
+  <Edit>DocumentLibraryForm</Edit>
+  <New>DocumentLibraryForm</New>
+</FormTemplates>
+</file>
+
 <file path=customXml/itemProps1.xml><?xml version="1.0" encoding="utf-8"?>
-<ds:datastoreItem xmlns:ds="http://schemas.openxmlformats.org/officeDocument/2006/customXml" ds:itemID="{6E42620F-EA52-46A3-AF92-9188E2FB2822}">
+<ds:datastoreItem xmlns:ds="http://schemas.openxmlformats.org/officeDocument/2006/customXml" ds:itemID="{A0AC0BCA-7724-4C8A-92DC-0D15359ECDC3}">
   <ds:schemaRefs>
-    <ds:schemaRef ds:uri="http://schemas.microsoft.com/sharepoint/v3/contenttype/forms"/>
+    <ds:schemaRef ds:uri="http://schemas.microsoft.com/office/2006/metadata/contentType"/>
+    <ds:schemaRef ds:uri="http://schemas.microsoft.com/office/2006/metadata/properties/metaAttributes"/>
+    <ds:schemaRef ds:uri="http://www.w3.org/2001/XMLSchema"/>
+    <ds:schemaRef ds:uri="http://schemas.microsoft.com/office/2006/metadata/properties"/>
+    <ds:schemaRef ds:uri="15c23b83-0a74-4dd8-96fd-c1cdb1965e64"/>
+    <ds:schemaRef ds:uri="a9d0ce2f-9ce2-4b22-8e2a-723aa410c551"/>
+    <ds:schemaRef ds:uri="http://schemas.microsoft.com/office/2006/documentManagement/types"/>
+    <ds:schemaRef ds:uri="http://schemas.microsoft.com/office/infopath/2007/PartnerControls"/>
+    <ds:schemaRef ds:uri="http://schemas.openxmlformats.org/package/2006/metadata/core-properties"/>
+    <ds:schemaRef ds:uri="http://purl.org/dc/elements/1.1/"/>
+    <ds:schemaRef ds:uri="http://purl.org/dc/terms/"/>
+    <ds:schemaRef ds:uri="http://schemas.microsoft.com/internal/obd"/>
   </ds:schemaRefs>
 </ds:datastoreItem>
 </file>
@@ -3051,20 +3120,9 @@
 </file>
 
 <file path=customXml/itemProps3.xml><?xml version="1.0" encoding="utf-8"?>
-<ds:datastoreItem xmlns:ds="http://schemas.openxmlformats.org/officeDocument/2006/customXml" ds:itemID="{A0AC0BCA-7724-4C8A-92DC-0D15359ECDC3}">
+<ds:datastoreItem xmlns:ds="http://schemas.openxmlformats.org/officeDocument/2006/customXml" ds:itemID="{6E42620F-EA52-46A3-AF92-9188E2FB2822}">
   <ds:schemaRefs>
-    <ds:schemaRef ds:uri="http://schemas.microsoft.com/office/2006/metadata/contentType"/>
-    <ds:schemaRef ds:uri="http://schemas.microsoft.com/office/2006/metadata/properties/metaAttributes"/>
-    <ds:schemaRef ds:uri="http://www.w3.org/2001/XMLSchema"/>
-    <ds:schemaRef ds:uri="http://schemas.microsoft.com/office/2006/metadata/properties"/>
-    <ds:schemaRef ds:uri="15c23b83-0a74-4dd8-96fd-c1cdb1965e64"/>
-    <ds:schemaRef ds:uri="a9d0ce2f-9ce2-4b22-8e2a-723aa410c551"/>
-    <ds:schemaRef ds:uri="http://schemas.microsoft.com/office/2006/documentManagement/types"/>
-    <ds:schemaRef ds:uri="http://schemas.microsoft.com/office/infopath/2007/PartnerControls"/>
-    <ds:schemaRef ds:uri="http://schemas.openxmlformats.org/package/2006/metadata/core-properties"/>
-    <ds:schemaRef ds:uri="http://purl.org/dc/elements/1.1/"/>
-    <ds:schemaRef ds:uri="http://purl.org/dc/terms/"/>
-    <ds:schemaRef ds:uri="http://schemas.microsoft.com/internal/obd"/>
+    <ds:schemaRef ds:uri="http://schemas.microsoft.com/sharepoint/v3/contenttype/forms"/>
   </ds:schemaRefs>
 </ds:datastoreItem>
 </file>
</xml_diff>